<commit_message>
27 мар 2024 г.  9:00:27
</commit_message>
<xml_diff>
--- a/README.docx
+++ b/README.docx
@@ -1,6 +1,6 @@
 
 <file path=word/document.xml><?xml version="1.0" encoding="utf-8"?>
-<w:document xmlns:wpc="http://schemas.microsoft.com/office/word/2010/wordprocessingCanvas" xmlns:mc="http://schemas.openxmlformats.org/markup-compatibility/2006" xmlns:o="urn:schemas-microsoft-com:office:office" xmlns:r="http://schemas.openxmlformats.org/officeDocument/2006/relationships" xmlns:m="http://schemas.openxmlformats.org/officeDocument/2006/math" xmlns:v="urn:schemas-microsoft-com:vml" xmlns:wp14="http://schemas.microsoft.com/office/word/2010/wordprocessingDrawing" xmlns:wp="http://schemas.openxmlformats.org/drawingml/2006/wordprocessingDrawing" xmlns:w10="urn:schemas-microsoft-com:office:word" xmlns:w="http://schemas.openxmlformats.org/wordprocessingml/2006/main" xmlns:w14="http://schemas.microsoft.com/office/word/2010/wordml" xmlns:wpg="http://schemas.microsoft.com/office/word/2010/wordprocessingGroup" xmlns:wpi="http://schemas.microsoft.com/office/word/2010/wordprocessingInk" xmlns:wne="http://schemas.microsoft.com/office/word/2006/wordml" xmlns:wps="http://schemas.microsoft.com/office/word/2010/wordprocessingShape" mc:Ignorable="w14 wp14">
+<w:document xmlns:wpc="http://schemas.microsoft.com/office/word/2010/wordprocessingCanvas" xmlns:mc="http://schemas.openxmlformats.org/markup-compatibility/2006" xmlns:o="urn:schemas-microsoft-com:office:office" xmlns:r="http://schemas.openxmlformats.org/officeDocument/2006/relationships" xmlns:m="http://schemas.openxmlformats.org/officeDocument/2006/math" xmlns:v="urn:schemas-microsoft-com:vml" xmlns:wp14="http://schemas.microsoft.com/office/word/2010/wordprocessingDrawing" xmlns:wp="http://schemas.openxmlformats.org/drawingml/2006/wordprocessingDrawing" xmlns:w10="urn:schemas-microsoft-com:office:word" xmlns:w="http://schemas.openxmlformats.org/wordprocessingml/2006/main" xmlns:w14="http://schemas.microsoft.com/office/word/2010/wordml" xmlns:w15="http://schemas.microsoft.com/office/word/2012/wordml" xmlns:wpg="http://schemas.microsoft.com/office/word/2010/wordprocessingGroup" xmlns:wpi="http://schemas.microsoft.com/office/word/2010/wordprocessingInk" xmlns:wne="http://schemas.microsoft.com/office/word/2006/wordml" xmlns:wps="http://schemas.microsoft.com/office/word/2010/wordprocessingShape" mc:Ignorable="w14 w15 wp14">
   <w:body>
     <w:p>
       <w:pPr>
@@ -32,7 +32,7 @@
                     <pic:cNvPicPr/>
                   </pic:nvPicPr>
                   <pic:blipFill>
-                    <a:blip r:embed="rId5"/>
+                    <a:blip r:embed="rId4"/>
                     <a:stretch>
                       <a:fillRect/>
                     </a:stretch>
@@ -111,7 +111,7 @@
                     </pic:cNvPicPr>
                   </pic:nvPicPr>
                   <pic:blipFill>
-                    <a:blip r:embed="rId6">
+                    <a:blip r:embed="rId5">
                       <a:extLst>
                         <a:ext uri="{28A0092B-C50C-407E-A947-70E740481C1C}">
                           <a14:useLocalDpi xmlns:a14="http://schemas.microsoft.com/office/drawing/2010/main" val="0"/>
@@ -170,7 +170,7 @@
                     <pic:cNvPicPr/>
                   </pic:nvPicPr>
                   <pic:blipFill>
-                    <a:blip r:embed="rId7"/>
+                    <a:blip r:embed="rId6"/>
                     <a:stretch>
                       <a:fillRect/>
                     </a:stretch>
@@ -229,7 +229,7 @@
                     </pic:cNvPicPr>
                   </pic:nvPicPr>
                   <pic:blipFill>
-                    <a:blip r:embed="rId8">
+                    <a:blip r:embed="rId7">
                       <a:extLst>
                         <a:ext uri="{28A0092B-C50C-407E-A947-70E740481C1C}">
                           <a14:useLocalDpi xmlns:a14="http://schemas.microsoft.com/office/drawing/2010/main" val="0"/>
@@ -286,7 +286,7 @@
                     </pic:cNvPicPr>
                   </pic:nvPicPr>
                   <pic:blipFill>
-                    <a:blip r:embed="rId9">
+                    <a:blip r:embed="rId8">
                       <a:extLst>
                         <a:ext uri="{28A0092B-C50C-407E-A947-70E740481C1C}">
                           <a14:useLocalDpi xmlns:a14="http://schemas.microsoft.com/office/drawing/2010/main" val="0"/>
@@ -369,7 +369,7 @@
                     <pic:cNvPicPr/>
                   </pic:nvPicPr>
                   <pic:blipFill>
-                    <a:blip r:embed="rId10"/>
+                    <a:blip r:embed="rId9"/>
                     <a:stretch>
                       <a:fillRect/>
                     </a:stretch>
@@ -429,6 +429,49 @@
             <wp:extent cx="3160800" cy="1944000"/>
             <wp:effectExtent l="0" t="0" r="1905" b="0"/>
             <wp:docPr id="8" name="Рисунок 8"/>
+            <wp:cNvGraphicFramePr>
+              <a:graphicFrameLocks xmlns:a="http://schemas.openxmlformats.org/drawingml/2006/main" noChangeAspect="1"/>
+            </wp:cNvGraphicFramePr>
+            <a:graphic xmlns:a="http://schemas.openxmlformats.org/drawingml/2006/main">
+              <a:graphicData uri="http://schemas.openxmlformats.org/drawingml/2006/picture">
+                <pic:pic xmlns:pic="http://schemas.openxmlformats.org/drawingml/2006/picture">
+                  <pic:nvPicPr>
+                    <pic:cNvPr id="0" name=""/>
+                    <pic:cNvPicPr/>
+                  </pic:nvPicPr>
+                  <pic:blipFill>
+                    <a:blip r:embed="rId10"/>
+                    <a:stretch>
+                      <a:fillRect/>
+                    </a:stretch>
+                  </pic:blipFill>
+                  <pic:spPr>
+                    <a:xfrm>
+                      <a:off x="0" y="0"/>
+                      <a:ext cx="3160800" cy="1944000"/>
+                    </a:xfrm>
+                    <a:prstGeom prst="rect">
+                      <a:avLst/>
+                    </a:prstGeom>
+                  </pic:spPr>
+                </pic:pic>
+              </a:graphicData>
+            </a:graphic>
+          </wp:inline>
+        </w:drawing>
+      </w:r>
+    </w:p>
+    <w:p>
+      <w:r>
+        <w:rPr>
+          <w:noProof/>
+          <w:lang w:val="uk-UA" w:eastAsia="uk-UA"/>
+        </w:rPr>
+        <w:drawing>
+          <wp:inline distT="0" distB="0" distL="0" distR="0" wp14:anchorId="016EFEA4" wp14:editId="76F53305">
+            <wp:extent cx="3193200" cy="1587600"/>
+            <wp:effectExtent l="0" t="0" r="7620" b="0"/>
+            <wp:docPr id="9" name="Рисунок 9"/>
             <wp:cNvGraphicFramePr>
               <a:graphicFrameLocks xmlns:a="http://schemas.openxmlformats.org/drawingml/2006/main" noChangeAspect="1"/>
             </wp:cNvGraphicFramePr>
@@ -448,7 +491,7 @@
                   <pic:spPr>
                     <a:xfrm>
                       <a:off x="0" y="0"/>
-                      <a:ext cx="3160800" cy="1944000"/>
+                      <a:ext cx="3193200" cy="1587600"/>
                     </a:xfrm>
                     <a:prstGeom prst="rect">
                       <a:avLst/>
@@ -463,15 +506,75 @@
     </w:p>
     <w:p>
       <w:r>
+        <w:t xml:space="preserve">Нажмите клавишу </w:t>
+      </w:r>
+      <w:r>
+        <w:rPr>
+          <w:lang w:val="en-US"/>
+        </w:rPr>
+        <w:t>Enter</w:t>
+      </w:r>
+    </w:p>
+    <w:p>
+      <w:r>
+        <w:lastRenderedPageBreak/>
+        <w:t xml:space="preserve">7. </w:t>
+      </w:r>
+      <w:r>
+        <w:t xml:space="preserve">Запустите </w:t>
+      </w:r>
+      <w:r>
+        <w:rPr>
+          <w:lang w:val="en-US"/>
+        </w:rPr>
+        <w:t>AutoCAD</w:t>
+      </w:r>
+      <w:r>
+        <w:t xml:space="preserve"> </w:t>
+      </w:r>
+      <w:r>
+        <w:t>на выполнение</w:t>
+      </w:r>
+    </w:p>
+    <w:p>
+      <w:pPr>
+        <w:keepNext/>
+        <w:rPr>
+          <w:lang w:val="en-US"/>
+        </w:rPr>
+      </w:pPr>
+      <w:r>
+        <w:rPr>
+          <w:lang w:val="en-US"/>
+        </w:rPr>
+        <w:t xml:space="preserve">8. </w:t>
+      </w:r>
+      <w:r>
+        <w:t xml:space="preserve">Выполните команду </w:t>
+      </w:r>
+      <w:r>
+        <w:rPr>
+          <w:lang w:val="en-US"/>
+        </w:rPr>
+        <w:t>_CUI</w:t>
+      </w:r>
+    </w:p>
+    <w:p>
+      <w:pPr>
+        <w:rPr>
+          <w:lang w:val="en-US"/>
+        </w:rPr>
+      </w:pPr>
+      <w:r>
         <w:rPr>
           <w:noProof/>
           <w:lang w:val="uk-UA" w:eastAsia="uk-UA"/>
         </w:rPr>
         <w:drawing>
-          <wp:inline distT="0" distB="0" distL="0" distR="0" wp14:anchorId="016EFEA4" wp14:editId="76F53305">
-            <wp:extent cx="3193200" cy="1587600"/>
-            <wp:effectExtent l="0" t="0" r="7620" b="0"/>
-            <wp:docPr id="9" name="Рисунок 9"/>
+          <wp:inline distT="0" distB="0" distL="0" distR="0" wp14:anchorId="2335919D" wp14:editId="2932B395">
+            <wp:extent cx="3805200" cy="2250000"/>
+            <wp:effectExtent l="0" t="0" r="5080" b="0"/>
+            <wp:docPr id="10" name="Рисунок 10"/>
             <wp:cNvGraphicFramePr>
               <a:graphicFrameLocks xmlns:a="http://schemas.openxmlformats.org/drawingml/2006/main" noChangeAspect="1"/>
             </wp:cNvGraphicFramePr>
@@ -491,109 +594,6 @@
                   <pic:spPr>
                     <a:xfrm>
                       <a:off x="0" y="0"/>
-                      <a:ext cx="3193200" cy="1587600"/>
-                    </a:xfrm>
-                    <a:prstGeom prst="rect">
-                      <a:avLst/>
-                    </a:prstGeom>
-                  </pic:spPr>
-                </pic:pic>
-              </a:graphicData>
-            </a:graphic>
-          </wp:inline>
-        </w:drawing>
-      </w:r>
-    </w:p>
-    <w:p>
-      <w:r>
-        <w:t xml:space="preserve">Нажмите клавишу </w:t>
-      </w:r>
-      <w:r>
-        <w:rPr>
-          <w:lang w:val="en-US"/>
-        </w:rPr>
-        <w:t>Enter</w:t>
-      </w:r>
-    </w:p>
-    <w:p>
-      <w:r>
-        <w:lastRenderedPageBreak/>
-        <w:t xml:space="preserve">7. </w:t>
-      </w:r>
-      <w:r>
-        <w:t xml:space="preserve">Запустите </w:t>
-      </w:r>
-      <w:r>
-        <w:rPr>
-          <w:lang w:val="en-US"/>
-        </w:rPr>
-        <w:t>AutoCAD</w:t>
-      </w:r>
-      <w:r>
-        <w:t xml:space="preserve"> </w:t>
-      </w:r>
-      <w:r>
-        <w:t>на выполнение</w:t>
-      </w:r>
-    </w:p>
-    <w:p>
-      <w:pPr>
-        <w:keepNext/>
-        <w:rPr>
-          <w:lang w:val="en-US"/>
-        </w:rPr>
-      </w:pPr>
-      <w:r>
-        <w:rPr>
-          <w:lang w:val="en-US"/>
-        </w:rPr>
-        <w:t xml:space="preserve">8. </w:t>
-      </w:r>
-      <w:r>
-        <w:t xml:space="preserve">Выполните команду </w:t>
-      </w:r>
-      <w:r>
-        <w:rPr>
-          <w:lang w:val="en-US"/>
-        </w:rPr>
-        <w:t>_CUI</w:t>
-      </w:r>
-    </w:p>
-    <w:p>
-      <w:pPr>
-        <w:rPr>
-          <w:lang w:val="en-US"/>
-        </w:rPr>
-      </w:pPr>
-      <w:r>
-        <w:rPr>
-          <w:noProof/>
-          <w:lang w:val="uk-UA" w:eastAsia="uk-UA"/>
-        </w:rPr>
-        <w:drawing>
-          <wp:inline distT="0" distB="0" distL="0" distR="0" wp14:anchorId="2335919D" wp14:editId="2932B395">
-            <wp:extent cx="3805200" cy="2250000"/>
-            <wp:effectExtent l="0" t="0" r="5080" b="0"/>
-            <wp:docPr id="10" name="Рисунок 10"/>
-            <wp:cNvGraphicFramePr>
-              <a:graphicFrameLocks xmlns:a="http://schemas.openxmlformats.org/drawingml/2006/main" noChangeAspect="1"/>
-            </wp:cNvGraphicFramePr>
-            <a:graphic xmlns:a="http://schemas.openxmlformats.org/drawingml/2006/main">
-              <a:graphicData uri="http://schemas.openxmlformats.org/drawingml/2006/picture">
-                <pic:pic xmlns:pic="http://schemas.openxmlformats.org/drawingml/2006/picture">
-                  <pic:nvPicPr>
-                    <pic:cNvPr id="0" name=""/>
-                    <pic:cNvPicPr/>
-                  </pic:nvPicPr>
-                  <pic:blipFill>
-                    <a:blip r:embed="rId13"/>
-                    <a:stretch>
-                      <a:fillRect/>
-                    </a:stretch>
-                  </pic:blipFill>
-                  <pic:spPr>
-                    <a:xfrm>
-                      <a:off x="0" y="0"/>
                       <a:ext cx="3805200" cy="2250000"/>
                     </a:xfrm>
                     <a:prstGeom prst="rect">
@@ -612,7 +612,19 @@
         <w:keepNext/>
       </w:pPr>
       <w:r>
-        <w:t>Нажмите папку со значком «+»</w:t>
+        <w:t xml:space="preserve">Нажмите </w:t>
+      </w:r>
+      <w:r>
+        <w:t xml:space="preserve">кнопку с изображением </w:t>
+      </w:r>
+      <w:r>
+        <w:t>папк</w:t>
+      </w:r>
+      <w:r>
+        <w:t>и</w:t>
+      </w:r>
+      <w:r>
+        <w:t xml:space="preserve"> со значком «+»</w:t>
       </w:r>
     </w:p>
     <w:p>
@@ -622,10 +634,112 @@
           <w:lang w:val="uk-UA" w:eastAsia="uk-UA"/>
         </w:rPr>
         <w:drawing>
-          <wp:inline distT="0" distB="0" distL="0" distR="0" wp14:anchorId="468EADAE" wp14:editId="248FBE90">
-            <wp:extent cx="3452400" cy="3348000"/>
-            <wp:effectExtent l="0" t="0" r="0" b="5080"/>
-            <wp:docPr id="11" name="Рисунок 11"/>
+          <wp:inline distT="0" distB="0" distL="0" distR="0">
+            <wp:extent cx="3710587" cy="3600000"/>
+            <wp:effectExtent l="0" t="0" r="4445" b="635"/>
+            <wp:docPr id="6" name="Рисунок 6" descr="D:\home\_namatv\develop\MNAS_acad_utils\image\image010.jpg"/>
+            <wp:cNvGraphicFramePr>
+              <a:graphicFrameLocks xmlns:a="http://schemas.openxmlformats.org/drawingml/2006/main" noChangeAspect="1"/>
+            </wp:cNvGraphicFramePr>
+            <a:graphic xmlns:a="http://schemas.openxmlformats.org/drawingml/2006/main">
+              <a:graphicData uri="http://schemas.openxmlformats.org/drawingml/2006/picture">
+                <pic:pic xmlns:pic="http://schemas.openxmlformats.org/drawingml/2006/picture">
+                  <pic:nvPicPr>
+                    <pic:cNvPr id="0" name="Picture 1" descr="D:\home\_namatv\develop\MNAS_acad_utils\image\image010.jpg"/>
+                    <pic:cNvPicPr>
+                      <a:picLocks noChangeAspect="1" noChangeArrowheads="1"/>
+                    </pic:cNvPicPr>
+                  </pic:nvPicPr>
+                  <pic:blipFill>
+                    <a:blip r:embed="rId13">
+                      <a:extLst>
+                        <a:ext uri="{28A0092B-C50C-407E-A947-70E740481C1C}">
+                          <a14:useLocalDpi xmlns:a14="http://schemas.microsoft.com/office/drawing/2010/main" val="0"/>
+                        </a:ext>
+                      </a:extLst>
+                    </a:blip>
+                    <a:srcRect/>
+                    <a:stretch>
+                      <a:fillRect/>
+                    </a:stretch>
+                  </pic:blipFill>
+                  <pic:spPr bwMode="auto">
+                    <a:xfrm>
+                      <a:off x="0" y="0"/>
+                      <a:ext cx="3710587" cy="3600000"/>
+                    </a:xfrm>
+                    <a:prstGeom prst="rect">
+                      <a:avLst/>
+                    </a:prstGeom>
+                    <a:noFill/>
+                    <a:ln>
+                      <a:noFill/>
+                    </a:ln>
+                  </pic:spPr>
+                </pic:pic>
+              </a:graphicData>
+            </a:graphic>
+          </wp:inline>
+        </w:drawing>
+      </w:r>
+      <w:bookmarkStart w:id="0" w:name="_GoBack"/>
+      <w:bookmarkEnd w:id="0"/>
+    </w:p>
+    <w:p>
+      <w:pPr>
+        <w:keepNext/>
+      </w:pPr>
+      <w:r>
+        <w:lastRenderedPageBreak/>
+        <w:t xml:space="preserve">Выберите файл адаптации </w:t>
+      </w:r>
+      <w:r>
+        <w:t>из .</w:t>
+      </w:r>
+      <w:r>
+        <w:t>\</w:t>
+      </w:r>
+      <w:proofErr w:type="spellStart"/>
+      <w:r>
+        <w:t>Vasyliy</w:t>
+      </w:r>
+      <w:proofErr w:type="spellEnd"/>
+      <w:r>
+        <w:t>\</w:t>
+      </w:r>
+      <w:proofErr w:type="spellStart"/>
+      <w:r>
+        <w:t>MNAS_acad_utils</w:t>
+      </w:r>
+      <w:proofErr w:type="spellEnd"/>
+      <w:r>
+        <w:t>\</w:t>
+      </w:r>
+      <w:proofErr w:type="spellStart"/>
+      <w:r>
+        <w:t>acad.mnu</w:t>
+      </w:r>
+      <w:proofErr w:type="spellEnd"/>
+      <w:r>
+        <w:t>\</w:t>
+      </w:r>
+      <w:proofErr w:type="spellStart"/>
+      <w:r>
+        <w:t>MNASoft.cuix</w:t>
+      </w:r>
+      <w:proofErr w:type="spellEnd"/>
+    </w:p>
+    <w:p>
+      <w:r>
+        <w:rPr>
+          <w:noProof/>
+          <w:lang w:val="uk-UA" w:eastAsia="uk-UA"/>
+        </w:rPr>
+        <w:drawing>
+          <wp:inline distT="0" distB="0" distL="0" distR="0" wp14:anchorId="7C1BAB9C" wp14:editId="4334CEE7">
+            <wp:extent cx="3668400" cy="2066400"/>
+            <wp:effectExtent l="0" t="0" r="8255" b="0"/>
+            <wp:docPr id="12" name="Рисунок 12"/>
             <wp:cNvGraphicFramePr>
               <a:graphicFrameLocks xmlns:a="http://schemas.openxmlformats.org/drawingml/2006/main" noChangeAspect="1"/>
             </wp:cNvGraphicFramePr>
@@ -645,7 +759,7 @@
                   <pic:spPr>
                     <a:xfrm>
                       <a:off x="0" y="0"/>
-                      <a:ext cx="3452400" cy="3348000"/>
+                      <a:ext cx="3668400" cy="2066400"/>
                     </a:xfrm>
                     <a:prstGeom prst="rect">
                       <a:avLst/>
@@ -661,58 +775,36 @@
     <w:p>
       <w:pPr>
         <w:keepNext/>
+        <w:rPr>
+          <w:lang w:val="el-GR"/>
+        </w:rPr>
       </w:pPr>
       <w:r>
-        <w:lastRenderedPageBreak/>
-        <w:t xml:space="preserve">Выберите файл адаптации </w:t>
-      </w:r>
-      <w:r>
-        <w:t>из .</w:t>
-      </w:r>
-      <w:r>
-        <w:t>\</w:t>
-      </w:r>
-      <w:proofErr w:type="spellStart"/>
-      <w:r>
-        <w:t>Vasyliy</w:t>
-      </w:r>
-      <w:proofErr w:type="spellEnd"/>
-      <w:r>
-        <w:t>\</w:t>
-      </w:r>
-      <w:proofErr w:type="spellStart"/>
-      <w:r>
-        <w:t>MNAS_acad_utils</w:t>
-      </w:r>
-      <w:proofErr w:type="spellEnd"/>
-      <w:r>
-        <w:t>\</w:t>
-      </w:r>
-      <w:proofErr w:type="spellStart"/>
-      <w:r>
-        <w:t>acad.mnu</w:t>
-      </w:r>
-      <w:proofErr w:type="spellEnd"/>
-      <w:r>
-        <w:t>\</w:t>
-      </w:r>
-      <w:proofErr w:type="spellStart"/>
-      <w:r>
-        <w:t>MNASoft.cuix</w:t>
-      </w:r>
-      <w:proofErr w:type="spellEnd"/>
-    </w:p>
-    <w:p>
+        <w:t xml:space="preserve">Нажмите на кнопку </w:t>
+      </w:r>
+      <w:r>
+        <w:rPr>
+          <w:lang w:val="el-GR"/>
+        </w:rPr>
+        <w:t>ΟΚ</w:t>
+      </w:r>
+    </w:p>
+    <w:p>
+      <w:pPr>
+        <w:rPr>
+          <w:lang w:val="el-GR"/>
+        </w:rPr>
+      </w:pPr>
       <w:r>
         <w:rPr>
           <w:noProof/>
           <w:lang w:val="uk-UA" w:eastAsia="uk-UA"/>
         </w:rPr>
         <w:drawing>
-          <wp:inline distT="0" distB="0" distL="0" distR="0" wp14:anchorId="7C1BAB9C" wp14:editId="4334CEE7">
-            <wp:extent cx="3668400" cy="2066400"/>
-            <wp:effectExtent l="0" t="0" r="8255" b="0"/>
-            <wp:docPr id="12" name="Рисунок 12"/>
+          <wp:inline distT="0" distB="0" distL="0" distR="0" wp14:anchorId="7272B75A" wp14:editId="3CEBDCB9">
+            <wp:extent cx="5940425" cy="5760171"/>
+            <wp:effectExtent l="0" t="0" r="3175" b="0"/>
+            <wp:docPr id="13" name="Рисунок 13"/>
             <wp:cNvGraphicFramePr>
               <a:graphicFrameLocks xmlns:a="http://schemas.openxmlformats.org/drawingml/2006/main" noChangeAspect="1"/>
             </wp:cNvGraphicFramePr>
@@ -732,71 +824,6 @@
                   <pic:spPr>
                     <a:xfrm>
                       <a:off x="0" y="0"/>
-                      <a:ext cx="3668400" cy="2066400"/>
-                    </a:xfrm>
-                    <a:prstGeom prst="rect">
-                      <a:avLst/>
-                    </a:prstGeom>
-                  </pic:spPr>
-                </pic:pic>
-              </a:graphicData>
-            </a:graphic>
-          </wp:inline>
-        </w:drawing>
-      </w:r>
-    </w:p>
-    <w:p>
-      <w:pPr>
-        <w:keepNext/>
-        <w:rPr>
-          <w:lang w:val="el-GR"/>
-        </w:rPr>
-      </w:pPr>
-      <w:r>
-        <w:t xml:space="preserve">Нажмите на кнопку </w:t>
-      </w:r>
-      <w:r>
-        <w:rPr>
-          <w:lang w:val="el-GR"/>
-        </w:rPr>
-        <w:t>ΟΚ</w:t>
-      </w:r>
-    </w:p>
-    <w:p>
-      <w:pPr>
-        <w:rPr>
-          <w:lang w:val="el-GR"/>
-        </w:rPr>
-      </w:pPr>
-      <w:r>
-        <w:rPr>
-          <w:noProof/>
-          <w:lang w:val="uk-UA" w:eastAsia="uk-UA"/>
-        </w:rPr>
-        <w:drawing>
-          <wp:inline distT="0" distB="0" distL="0" distR="0" wp14:anchorId="7272B75A" wp14:editId="3CEBDCB9">
-            <wp:extent cx="5940425" cy="5760171"/>
-            <wp:effectExtent l="0" t="0" r="3175" b="0"/>
-            <wp:docPr id="13" name="Рисунок 13"/>
-            <wp:cNvGraphicFramePr>
-              <a:graphicFrameLocks xmlns:a="http://schemas.openxmlformats.org/drawingml/2006/main" noChangeAspect="1"/>
-            </wp:cNvGraphicFramePr>
-            <a:graphic xmlns:a="http://schemas.openxmlformats.org/drawingml/2006/main">
-              <a:graphicData uri="http://schemas.openxmlformats.org/drawingml/2006/picture">
-                <pic:pic xmlns:pic="http://schemas.openxmlformats.org/drawingml/2006/picture">
-                  <pic:nvPicPr>
-                    <pic:cNvPr id="0" name=""/>
-                    <pic:cNvPicPr/>
-                  </pic:nvPicPr>
-                  <pic:blipFill>
-                    <a:blip r:embed="rId16"/>
-                    <a:stretch>
-                      <a:fillRect/>
-                    </a:stretch>
-                  </pic:blipFill>
-                  <pic:spPr>
-                    <a:xfrm>
-                      <a:off x="0" y="0"/>
                       <a:ext cx="5940425" cy="5760171"/>
                     </a:xfrm>
                     <a:prstGeom prst="rect">
@@ -830,12 +857,7 @@
         <w:t>TRIANG</w:t>
       </w:r>
       <w:r>
-        <w:t xml:space="preserve"> для построения развертки ли</w:t>
-      </w:r>
-      <w:bookmarkStart w:id="0" w:name="_GoBack"/>
-      <w:bookmarkEnd w:id="0"/>
-      <w:r>
-        <w:t>нейчатой поверхности.</w:t>
+        <w:t xml:space="preserve"> для построения развертки линейчатой поверхности.</w:t>
       </w:r>
     </w:p>
     <w:sectPr>
@@ -849,7 +871,7 @@
 </file>
 
 <file path=word/styles.xml><?xml version="1.0" encoding="utf-8"?>
-<w:styles xmlns:mc="http://schemas.openxmlformats.org/markup-compatibility/2006" xmlns:r="http://schemas.openxmlformats.org/officeDocument/2006/relationships" xmlns:w="http://schemas.openxmlformats.org/wordprocessingml/2006/main" xmlns:w14="http://schemas.microsoft.com/office/word/2010/wordml" mc:Ignorable="w14">
+<w:styles xmlns:mc="http://schemas.openxmlformats.org/markup-compatibility/2006" xmlns:r="http://schemas.openxmlformats.org/officeDocument/2006/relationships" xmlns:w="http://schemas.openxmlformats.org/wordprocessingml/2006/main" xmlns:w14="http://schemas.microsoft.com/office/word/2010/wordml" xmlns:w15="http://schemas.microsoft.com/office/word/2012/wordml" mc:Ignorable="w14 w15">
   <w:docDefaults>
     <w:rPrDefault>
       <w:rPr>
@@ -865,144 +887,378 @@
       </w:pPr>
     </w:pPrDefault>
   </w:docDefaults>
-  <w:latentStyles w:defLockedState="0" w:defUIPriority="99" w:defSemiHidden="1" w:defUnhideWhenUsed="1" w:defQFormat="0" w:count="267">
-    <w:lsdException w:name="Normal" w:semiHidden="0" w:uiPriority="0" w:unhideWhenUsed="0" w:qFormat="1"/>
-    <w:lsdException w:name="heading 1" w:semiHidden="0" w:uiPriority="9" w:unhideWhenUsed="0" w:qFormat="1"/>
-    <w:lsdException w:name="heading 2" w:uiPriority="9" w:qFormat="1"/>
-    <w:lsdException w:name="heading 3" w:uiPriority="9" w:qFormat="1"/>
-    <w:lsdException w:name="heading 4" w:uiPriority="9" w:qFormat="1"/>
-    <w:lsdException w:name="heading 5" w:uiPriority="9" w:qFormat="1"/>
-    <w:lsdException w:name="heading 6" w:uiPriority="9" w:qFormat="1"/>
-    <w:lsdException w:name="heading 7" w:uiPriority="9" w:qFormat="1"/>
-    <w:lsdException w:name="heading 8" w:uiPriority="9" w:qFormat="1"/>
-    <w:lsdException w:name="heading 9" w:uiPriority="9" w:qFormat="1"/>
-    <w:lsdException w:name="toc 1" w:uiPriority="39"/>
-    <w:lsdException w:name="toc 2" w:uiPriority="39"/>
-    <w:lsdException w:name="toc 3" w:uiPriority="39"/>
-    <w:lsdException w:name="toc 4" w:uiPriority="39"/>
-    <w:lsdException w:name="toc 5" w:uiPriority="39"/>
-    <w:lsdException w:name="toc 6" w:uiPriority="39"/>
-    <w:lsdException w:name="toc 7" w:uiPriority="39"/>
-    <w:lsdException w:name="toc 8" w:uiPriority="39"/>
-    <w:lsdException w:name="toc 9" w:uiPriority="39"/>
-    <w:lsdException w:name="caption" w:uiPriority="35" w:qFormat="1"/>
-    <w:lsdException w:name="Title" w:semiHidden="0" w:uiPriority="10" w:unhideWhenUsed="0" w:qFormat="1"/>
-    <w:lsdException w:name="Default Paragraph Font" w:uiPriority="1"/>
-    <w:lsdException w:name="Subtitle" w:semiHidden="0" w:uiPriority="11" w:unhideWhenUsed="0" w:qFormat="1"/>
-    <w:lsdException w:name="Strong" w:semiHidden="0" w:uiPriority="22" w:unhideWhenUsed="0" w:qFormat="1"/>
-    <w:lsdException w:name="Emphasis" w:semiHidden="0" w:uiPriority="20" w:unhideWhenUsed="0" w:qFormat="1"/>
-    <w:lsdException w:name="Table Grid" w:semiHidden="0" w:uiPriority="59" w:unhideWhenUsed="0"/>
-    <w:lsdException w:name="Placeholder Text" w:unhideWhenUsed="0"/>
-    <w:lsdException w:name="No Spacing" w:semiHidden="0" w:uiPriority="1" w:unhideWhenUsed="0" w:qFormat="1"/>
-    <w:lsdException w:name="Light Shading" w:semiHidden="0" w:uiPriority="60" w:unhideWhenUsed="0"/>
-    <w:lsdException w:name="Light List" w:semiHidden="0" w:uiPriority="61" w:unhideWhenUsed="0"/>
-    <w:lsdException w:name="Light Grid" w:semiHidden="0" w:uiPriority="62" w:unhideWhenUsed="0"/>
-    <w:lsdException w:name="Medium Shading 1" w:semiHidden="0" w:uiPriority="63" w:unhideWhenUsed="0"/>
-    <w:lsdException w:name="Medium Shading 2" w:semiHidden="0" w:uiPriority="64" w:unhideWhenUsed="0"/>
-    <w:lsdException w:name="Medium List 1" w:semiHidden="0" w:uiPriority="65" w:unhideWhenUsed="0"/>
-    <w:lsdException w:name="Medium List 2" w:semiHidden="0" w:uiPriority="66" w:unhideWhenUsed="0"/>
-    <w:lsdException w:name="Medium Grid 1" w:semiHidden="0" w:uiPriority="67" w:unhideWhenUsed="0"/>
-    <w:lsdException w:name="Medium Grid 2" w:semiHidden="0" w:uiPriority="68" w:unhideWhenUsed="0"/>
-    <w:lsdException w:name="Medium Grid 3" w:semiHidden="0" w:uiPriority="69" w:unhideWhenUsed="0"/>
-    <w:lsdException w:name="Dark List" w:semiHidden="0" w:uiPriority="70" w:unhideWhenUsed="0"/>
-    <w:lsdException w:name="Colorful Shading" w:semiHidden="0" w:uiPriority="71" w:unhideWhenUsed="0"/>
-    <w:lsdException w:name="Colorful List" w:semiHidden="0" w:uiPriority="72" w:unhideWhenUsed="0"/>
-    <w:lsdException w:name="Colorful Grid" w:semiHidden="0" w:uiPriority="73" w:unhideWhenUsed="0"/>
-    <w:lsdException w:name="Light Shading Accent 1" w:semiHidden="0" w:uiPriority="60" w:unhideWhenUsed="0"/>
-    <w:lsdException w:name="Light List Accent 1" w:semiHidden="0" w:uiPriority="61" w:unhideWhenUsed="0"/>
-    <w:lsdException w:name="Light Grid Accent 1" w:semiHidden="0" w:uiPriority="62" w:unhideWhenUsed="0"/>
-    <w:lsdException w:name="Medium Shading 1 Accent 1" w:semiHidden="0" w:uiPriority="63" w:unhideWhenUsed="0"/>
-    <w:lsdException w:name="Medium Shading 2 Accent 1" w:semiHidden="0" w:uiPriority="64" w:unhideWhenUsed="0"/>
-    <w:lsdException w:name="Medium List 1 Accent 1" w:semiHidden="0" w:uiPriority="65" w:unhideWhenUsed="0"/>
-    <w:lsdException w:name="Revision" w:unhideWhenUsed="0"/>
-    <w:lsdException w:name="List Paragraph" w:semiHidden="0" w:uiPriority="34" w:unhideWhenUsed="0" w:qFormat="1"/>
-    <w:lsdException w:name="Quote" w:semiHidden="0" w:uiPriority="29" w:unhideWhenUsed="0" w:qFormat="1"/>
-    <w:lsdException w:name="Intense Quote" w:semiHidden="0" w:uiPriority="30" w:unhideWhenUsed="0" w:qFormat="1"/>
-    <w:lsdException w:name="Medium List 2 Accent 1" w:semiHidden="0" w:uiPriority="66" w:unhideWhenUsed="0"/>
-    <w:lsdException w:name="Medium Grid 1 Accent 1" w:semiHidden="0" w:uiPriority="67" w:unhideWhenUsed="0"/>
-    <w:lsdException w:name="Medium Grid 2 Accent 1" w:semiHidden="0" w:uiPriority="68" w:unhideWhenUsed="0"/>
-    <w:lsdException w:name="Medium Grid 3 Accent 1" w:semiHidden="0" w:uiPriority="69" w:unhideWhenUsed="0"/>
-    <w:lsdException w:name="Dark List Accent 1" w:semiHidden="0" w:uiPriority="70" w:unhideWhenUsed="0"/>
-    <w:lsdException w:name="Colorful Shading Accent 1" w:semiHidden="0" w:uiPriority="71" w:unhideWhenUsed="0"/>
-    <w:lsdException w:name="Colorful List Accent 1" w:semiHidden="0" w:uiPriority="72" w:unhideWhenUsed="0"/>
-    <w:lsdException w:name="Colorful Grid Accent 1" w:semiHidden="0" w:uiPriority="73" w:unhideWhenUsed="0"/>
-    <w:lsdException w:name="Light Shading Accent 2" w:semiHidden="0" w:uiPriority="60" w:unhideWhenUsed="0"/>
-    <w:lsdException w:name="Light List Accent 2" w:semiHidden="0" w:uiPriority="61" w:unhideWhenUsed="0"/>
-    <w:lsdException w:name="Light Grid Accent 2" w:semiHidden="0" w:uiPriority="62" w:unhideWhenUsed="0"/>
-    <w:lsdException w:name="Medium Shading 1 Accent 2" w:semiHidden="0" w:uiPriority="63" w:unhideWhenUsed="0"/>
-    <w:lsdException w:name="Medium Shading 2 Accent 2" w:semiHidden="0" w:uiPriority="64" w:unhideWhenUsed="0"/>
-    <w:lsdException w:name="Medium List 1 Accent 2" w:semiHidden="0" w:uiPriority="65" w:unhideWhenUsed="0"/>
-    <w:lsdException w:name="Medium List 2 Accent 2" w:semiHidden="0" w:uiPriority="66" w:unhideWhenUsed="0"/>
-    <w:lsdException w:name="Medium Grid 1 Accent 2" w:semiHidden="0" w:uiPriority="67" w:unhideWhenUsed="0"/>
-    <w:lsdException w:name="Medium Grid 2 Accent 2" w:semiHidden="0" w:uiPriority="68" w:unhideWhenUsed="0"/>
-    <w:lsdException w:name="Medium Grid 3 Accent 2" w:semiHidden="0" w:uiPriority="69" w:unhideWhenUsed="0"/>
-    <w:lsdException w:name="Dark List Accent 2" w:semiHidden="0" w:uiPriority="70" w:unhideWhenUsed="0"/>
-    <w:lsdException w:name="Colorful Shading Accent 2" w:semiHidden="0" w:uiPriority="71" w:unhideWhenUsed="0"/>
-    <w:lsdException w:name="Colorful List Accent 2" w:semiHidden="0" w:uiPriority="72" w:unhideWhenUsed="0"/>
-    <w:lsdException w:name="Colorful Grid Accent 2" w:semiHidden="0" w:uiPriority="73" w:unhideWhenUsed="0"/>
-    <w:lsdException w:name="Light Shading Accent 3" w:semiHidden="0" w:uiPriority="60" w:unhideWhenUsed="0"/>
-    <w:lsdException w:name="Light List Accent 3" w:semiHidden="0" w:uiPriority="61" w:unhideWhenUsed="0"/>
-    <w:lsdException w:name="Light Grid Accent 3" w:semiHidden="0" w:uiPriority="62" w:unhideWhenUsed="0"/>
-    <w:lsdException w:name="Medium Shading 1 Accent 3" w:semiHidden="0" w:uiPriority="63" w:unhideWhenUsed="0"/>
-    <w:lsdException w:name="Medium Shading 2 Accent 3" w:semiHidden="0" w:uiPriority="64" w:unhideWhenUsed="0"/>
-    <w:lsdException w:name="Medium List 1 Accent 3" w:semiHidden="0" w:uiPriority="65" w:unhideWhenUsed="0"/>
-    <w:lsdException w:name="Medium List 2 Accent 3" w:semiHidden="0" w:uiPriority="66" w:unhideWhenUsed="0"/>
-    <w:lsdException w:name="Medium Grid 1 Accent 3" w:semiHidden="0" w:uiPriority="67" w:unhideWhenUsed="0"/>
-    <w:lsdException w:name="Medium Grid 2 Accent 3" w:semiHidden="0" w:uiPriority="68" w:unhideWhenUsed="0"/>
-    <w:lsdException w:name="Medium Grid 3 Accent 3" w:semiHidden="0" w:uiPriority="69" w:unhideWhenUsed="0"/>
-    <w:lsdException w:name="Dark List Accent 3" w:semiHidden="0" w:uiPriority="70" w:unhideWhenUsed="0"/>
-    <w:lsdException w:name="Colorful Shading Accent 3" w:semiHidden="0" w:uiPriority="71" w:unhideWhenUsed="0"/>
-    <w:lsdException w:name="Colorful List Accent 3" w:semiHidden="0" w:uiPriority="72" w:unhideWhenUsed="0"/>
-    <w:lsdException w:name="Colorful Grid Accent 3" w:semiHidden="0" w:uiPriority="73" w:unhideWhenUsed="0"/>
-    <w:lsdException w:name="Light Shading Accent 4" w:semiHidden="0" w:uiPriority="60" w:unhideWhenUsed="0"/>
-    <w:lsdException w:name="Light List Accent 4" w:semiHidden="0" w:uiPriority="61" w:unhideWhenUsed="0"/>
-    <w:lsdException w:name="Light Grid Accent 4" w:semiHidden="0" w:uiPriority="62" w:unhideWhenUsed="0"/>
-    <w:lsdException w:name="Medium Shading 1 Accent 4" w:semiHidden="0" w:uiPriority="63" w:unhideWhenUsed="0"/>
-    <w:lsdException w:name="Medium Shading 2 Accent 4" w:semiHidden="0" w:uiPriority="64" w:unhideWhenUsed="0"/>
-    <w:lsdException w:name="Medium List 1 Accent 4" w:semiHidden="0" w:uiPriority="65" w:unhideWhenUsed="0"/>
-    <w:lsdException w:name="Medium List 2 Accent 4" w:semiHidden="0" w:uiPriority="66" w:unhideWhenUsed="0"/>
-    <w:lsdException w:name="Medium Grid 1 Accent 4" w:semiHidden="0" w:uiPriority="67" w:unhideWhenUsed="0"/>
-    <w:lsdException w:name="Medium Grid 2 Accent 4" w:semiHidden="0" w:uiPriority="68" w:unhideWhenUsed="0"/>
-    <w:lsdException w:name="Medium Grid 3 Accent 4" w:semiHidden="0" w:uiPriority="69" w:unhideWhenUsed="0"/>
-    <w:lsdException w:name="Dark List Accent 4" w:semiHidden="0" w:uiPriority="70" w:unhideWhenUsed="0"/>
-    <w:lsdException w:name="Colorful Shading Accent 4" w:semiHidden="0" w:uiPriority="71" w:unhideWhenUsed="0"/>
-    <w:lsdException w:name="Colorful List Accent 4" w:semiHidden="0" w:uiPriority="72" w:unhideWhenUsed="0"/>
-    <w:lsdException w:name="Colorful Grid Accent 4" w:semiHidden="0" w:uiPriority="73" w:unhideWhenUsed="0"/>
-    <w:lsdException w:name="Light Shading Accent 5" w:semiHidden="0" w:uiPriority="60" w:unhideWhenUsed="0"/>
-    <w:lsdException w:name="Light List Accent 5" w:semiHidden="0" w:uiPriority="61" w:unhideWhenUsed="0"/>
-    <w:lsdException w:name="Light Grid Accent 5" w:semiHidden="0" w:uiPriority="62" w:unhideWhenUsed="0"/>
-    <w:lsdException w:name="Medium Shading 1 Accent 5" w:semiHidden="0" w:uiPriority="63" w:unhideWhenUsed="0"/>
-    <w:lsdException w:name="Medium Shading 2 Accent 5" w:semiHidden="0" w:uiPriority="64" w:unhideWhenUsed="0"/>
-    <w:lsdException w:name="Medium List 1 Accent 5" w:semiHidden="0" w:uiPriority="65" w:unhideWhenUsed="0"/>
-    <w:lsdException w:name="Medium List 2 Accent 5" w:semiHidden="0" w:uiPriority="66" w:unhideWhenUsed="0"/>
-    <w:lsdException w:name="Medium Grid 1 Accent 5" w:semiHidden="0" w:uiPriority="67" w:unhideWhenUsed="0"/>
-    <w:lsdException w:name="Medium Grid 2 Accent 5" w:semiHidden="0" w:uiPriority="68" w:unhideWhenUsed="0"/>
-    <w:lsdException w:name="Medium Grid 3 Accent 5" w:semiHidden="0" w:uiPriority="69" w:unhideWhenUsed="0"/>
-    <w:lsdException w:name="Dark List Accent 5" w:semiHidden="0" w:uiPriority="70" w:unhideWhenUsed="0"/>
-    <w:lsdException w:name="Colorful Shading Accent 5" w:semiHidden="0" w:uiPriority="71" w:unhideWhenUsed="0"/>
-    <w:lsdException w:name="Colorful List Accent 5" w:semiHidden="0" w:uiPriority="72" w:unhideWhenUsed="0"/>
-    <w:lsdException w:name="Colorful Grid Accent 5" w:semiHidden="0" w:uiPriority="73" w:unhideWhenUsed="0"/>
-    <w:lsdException w:name="Light Shading Accent 6" w:semiHidden="0" w:uiPriority="60" w:unhideWhenUsed="0"/>
-    <w:lsdException w:name="Light List Accent 6" w:semiHidden="0" w:uiPriority="61" w:unhideWhenUsed="0"/>
-    <w:lsdException w:name="Light Grid Accent 6" w:semiHidden="0" w:uiPriority="62" w:unhideWhenUsed="0"/>
-    <w:lsdException w:name="Medium Shading 1 Accent 6" w:semiHidden="0" w:uiPriority="63" w:unhideWhenUsed="0"/>
-    <w:lsdException w:name="Medium Shading 2 Accent 6" w:semiHidden="0" w:uiPriority="64" w:unhideWhenUsed="0"/>
-    <w:lsdException w:name="Medium List 1 Accent 6" w:semiHidden="0" w:uiPriority="65" w:unhideWhenUsed="0"/>
-    <w:lsdException w:name="Medium List 2 Accent 6" w:semiHidden="0" w:uiPriority="66" w:unhideWhenUsed="0"/>
-    <w:lsdException w:name="Medium Grid 1 Accent 6" w:semiHidden="0" w:uiPriority="67" w:unhideWhenUsed="0"/>
-    <w:lsdException w:name="Medium Grid 2 Accent 6" w:semiHidden="0" w:uiPriority="68" w:unhideWhenUsed="0"/>
-    <w:lsdException w:name="Medium Grid 3 Accent 6" w:semiHidden="0" w:uiPriority="69" w:unhideWhenUsed="0"/>
-    <w:lsdException w:name="Dark List Accent 6" w:semiHidden="0" w:uiPriority="70" w:unhideWhenUsed="0"/>
-    <w:lsdException w:name="Colorful Shading Accent 6" w:semiHidden="0" w:uiPriority="71" w:unhideWhenUsed="0"/>
-    <w:lsdException w:name="Colorful List Accent 6" w:semiHidden="0" w:uiPriority="72" w:unhideWhenUsed="0"/>
-    <w:lsdException w:name="Colorful Grid Accent 6" w:semiHidden="0" w:uiPriority="73" w:unhideWhenUsed="0"/>
-    <w:lsdException w:name="Subtle Emphasis" w:semiHidden="0" w:uiPriority="19" w:unhideWhenUsed="0" w:qFormat="1"/>
-    <w:lsdException w:name="Intense Emphasis" w:semiHidden="0" w:uiPriority="21" w:unhideWhenUsed="0" w:qFormat="1"/>
-    <w:lsdException w:name="Subtle Reference" w:semiHidden="0" w:uiPriority="31" w:unhideWhenUsed="0" w:qFormat="1"/>
-    <w:lsdException w:name="Intense Reference" w:semiHidden="0" w:uiPriority="32" w:unhideWhenUsed="0" w:qFormat="1"/>
-    <w:lsdException w:name="Book Title" w:semiHidden="0" w:uiPriority="33" w:unhideWhenUsed="0" w:qFormat="1"/>
-    <w:lsdException w:name="Bibliography" w:uiPriority="37"/>
-    <w:lsdException w:name="TOC Heading" w:uiPriority="39" w:qFormat="1"/>
+  <w:latentStyles w:defLockedState="0" w:defUIPriority="99" w:defSemiHidden="0" w:defUnhideWhenUsed="0" w:defQFormat="0" w:count="371">
+    <w:lsdException w:name="Normal" w:uiPriority="0" w:qFormat="1"/>
+    <w:lsdException w:name="heading 1" w:uiPriority="9" w:qFormat="1"/>
+    <w:lsdException w:name="heading 2" w:semiHidden="1" w:uiPriority="9" w:unhideWhenUsed="1" w:qFormat="1"/>
+    <w:lsdException w:name="heading 3" w:semiHidden="1" w:uiPriority="9" w:unhideWhenUsed="1" w:qFormat="1"/>
+    <w:lsdException w:name="heading 4" w:semiHidden="1" w:uiPriority="9" w:unhideWhenUsed="1" w:qFormat="1"/>
+    <w:lsdException w:name="heading 5" w:semiHidden="1" w:uiPriority="9" w:unhideWhenUsed="1" w:qFormat="1"/>
+    <w:lsdException w:name="heading 6" w:semiHidden="1" w:uiPriority="9" w:unhideWhenUsed="1" w:qFormat="1"/>
+    <w:lsdException w:name="heading 7" w:semiHidden="1" w:uiPriority="9" w:unhideWhenUsed="1" w:qFormat="1"/>
+    <w:lsdException w:name="heading 8" w:semiHidden="1" w:uiPriority="9" w:unhideWhenUsed="1" w:qFormat="1"/>
+    <w:lsdException w:name="heading 9" w:semiHidden="1" w:uiPriority="9" w:unhideWhenUsed="1" w:qFormat="1"/>
+    <w:lsdException w:name="index 1" w:semiHidden="1" w:unhideWhenUsed="1"/>
+    <w:lsdException w:name="index 2" w:semiHidden="1" w:unhideWhenUsed="1"/>
+    <w:lsdException w:name="index 3" w:semiHidden="1" w:unhideWhenUsed="1"/>
+    <w:lsdException w:name="index 4" w:semiHidden="1" w:unhideWhenUsed="1"/>
+    <w:lsdException w:name="index 5" w:semiHidden="1" w:unhideWhenUsed="1"/>
+    <w:lsdException w:name="index 6" w:semiHidden="1" w:unhideWhenUsed="1"/>
+    <w:lsdException w:name="index 7" w:semiHidden="1" w:unhideWhenUsed="1"/>
+    <w:lsdException w:name="index 8" w:semiHidden="1" w:unhideWhenUsed="1"/>
+    <w:lsdException w:name="index 9" w:semiHidden="1" w:unhideWhenUsed="1"/>
+    <w:lsdException w:name="toc 1" w:semiHidden="1" w:uiPriority="39" w:unhideWhenUsed="1"/>
+    <w:lsdException w:name="toc 2" w:semiHidden="1" w:uiPriority="39" w:unhideWhenUsed="1"/>
+    <w:lsdException w:name="toc 3" w:semiHidden="1" w:uiPriority="39" w:unhideWhenUsed="1"/>
+    <w:lsdException w:name="toc 4" w:semiHidden="1" w:uiPriority="39" w:unhideWhenUsed="1"/>
+    <w:lsdException w:name="toc 5" w:semiHidden="1" w:uiPriority="39" w:unhideWhenUsed="1"/>
+    <w:lsdException w:name="toc 6" w:semiHidden="1" w:uiPriority="39" w:unhideWhenUsed="1"/>
+    <w:lsdException w:name="toc 7" w:semiHidden="1" w:uiPriority="39" w:unhideWhenUsed="1"/>
+    <w:lsdException w:name="toc 8" w:semiHidden="1" w:uiPriority="39" w:unhideWhenUsed="1"/>
+    <w:lsdException w:name="toc 9" w:semiHidden="1" w:uiPriority="39" w:unhideWhenUsed="1"/>
+    <w:lsdException w:name="Normal Indent" w:semiHidden="1" w:unhideWhenUsed="1"/>
+    <w:lsdException w:name="footnote text" w:semiHidden="1" w:unhideWhenUsed="1"/>
+    <w:lsdException w:name="annotation text" w:semiHidden="1" w:unhideWhenUsed="1"/>
+    <w:lsdException w:name="header" w:semiHidden="1" w:unhideWhenUsed="1"/>
+    <w:lsdException w:name="footer" w:semiHidden="1" w:unhideWhenUsed="1"/>
+    <w:lsdException w:name="index heading" w:semiHidden="1" w:unhideWhenUsed="1"/>
+    <w:lsdException w:name="caption" w:semiHidden="1" w:uiPriority="35" w:unhideWhenUsed="1" w:qFormat="1"/>
+    <w:lsdException w:name="table of figures" w:semiHidden="1" w:unhideWhenUsed="1"/>
+    <w:lsdException w:name="envelope address" w:semiHidden="1" w:unhideWhenUsed="1"/>
+    <w:lsdException w:name="envelope return" w:semiHidden="1" w:unhideWhenUsed="1"/>
+    <w:lsdException w:name="footnote reference" w:semiHidden="1" w:unhideWhenUsed="1"/>
+    <w:lsdException w:name="annotation reference" w:semiHidden="1" w:unhideWhenUsed="1"/>
+    <w:lsdException w:name="line number" w:semiHidden="1" w:unhideWhenUsed="1"/>
+    <w:lsdException w:name="page number" w:semiHidden="1" w:unhideWhenUsed="1"/>
+    <w:lsdException w:name="endnote reference" w:semiHidden="1" w:unhideWhenUsed="1"/>
+    <w:lsdException w:name="endnote text" w:semiHidden="1" w:unhideWhenUsed="1"/>
+    <w:lsdException w:name="table of authorities" w:semiHidden="1" w:unhideWhenUsed="1"/>
+    <w:lsdException w:name="macro" w:semiHidden="1" w:unhideWhenUsed="1"/>
+    <w:lsdException w:name="toa heading" w:semiHidden="1" w:unhideWhenUsed="1"/>
+    <w:lsdException w:name="List" w:semiHidden="1" w:unhideWhenUsed="1"/>
+    <w:lsdException w:name="List Bullet" w:semiHidden="1" w:unhideWhenUsed="1"/>
+    <w:lsdException w:name="List Number" w:semiHidden="1" w:unhideWhenUsed="1"/>
+    <w:lsdException w:name="List 2" w:semiHidden="1" w:unhideWhenUsed="1"/>
+    <w:lsdException w:name="List 3" w:semiHidden="1" w:unhideWhenUsed="1"/>
+    <w:lsdException w:name="List 4" w:semiHidden="1" w:unhideWhenUsed="1"/>
+    <w:lsdException w:name="List 5" w:semiHidden="1" w:unhideWhenUsed="1"/>
+    <w:lsdException w:name="List Bullet 2" w:semiHidden="1" w:unhideWhenUsed="1"/>
+    <w:lsdException w:name="List Bullet 3" w:semiHidden="1" w:unhideWhenUsed="1"/>
+    <w:lsdException w:name="List Bullet 4" w:semiHidden="1" w:unhideWhenUsed="1"/>
+    <w:lsdException w:name="List Bullet 5" w:semiHidden="1" w:unhideWhenUsed="1"/>
+    <w:lsdException w:name="List Number 2" w:semiHidden="1" w:unhideWhenUsed="1"/>
+    <w:lsdException w:name="List Number 3" w:semiHidden="1" w:unhideWhenUsed="1"/>
+    <w:lsdException w:name="List Number 4" w:semiHidden="1" w:unhideWhenUsed="1"/>
+    <w:lsdException w:name="List Number 5" w:semiHidden="1" w:unhideWhenUsed="1"/>
+    <w:lsdException w:name="Title" w:uiPriority="10" w:qFormat="1"/>
+    <w:lsdException w:name="Closing" w:semiHidden="1" w:unhideWhenUsed="1"/>
+    <w:lsdException w:name="Signature" w:semiHidden="1" w:unhideWhenUsed="1"/>
+    <w:lsdException w:name="Default Paragraph Font" w:semiHidden="1" w:uiPriority="1" w:unhideWhenUsed="1"/>
+    <w:lsdException w:name="Body Text" w:semiHidden="1" w:unhideWhenUsed="1"/>
+    <w:lsdException w:name="Body Text Indent" w:semiHidden="1" w:unhideWhenUsed="1"/>
+    <w:lsdException w:name="List Continue" w:semiHidden="1" w:unhideWhenUsed="1"/>
+    <w:lsdException w:name="List Continue 2" w:semiHidden="1" w:unhideWhenUsed="1"/>
+    <w:lsdException w:name="List Continue 3" w:semiHidden="1" w:unhideWhenUsed="1"/>
+    <w:lsdException w:name="List Continue 4" w:semiHidden="1" w:unhideWhenUsed="1"/>
+    <w:lsdException w:name="List Continue 5" w:semiHidden="1" w:unhideWhenUsed="1"/>
+    <w:lsdException w:name="Message Header" w:semiHidden="1" w:unhideWhenUsed="1"/>
+    <w:lsdException w:name="Subtitle" w:uiPriority="11" w:qFormat="1"/>
+    <w:lsdException w:name="Salutation" w:semiHidden="1" w:unhideWhenUsed="1"/>
+    <w:lsdException w:name="Date" w:semiHidden="1" w:unhideWhenUsed="1"/>
+    <w:lsdException w:name="Body Text First Indent" w:semiHidden="1" w:unhideWhenUsed="1"/>
+    <w:lsdException w:name="Body Text First Indent 2" w:semiHidden="1" w:unhideWhenUsed="1"/>
+    <w:lsdException w:name="Note Heading" w:semiHidden="1" w:unhideWhenUsed="1"/>
+    <w:lsdException w:name="Body Text 2" w:semiHidden="1" w:unhideWhenUsed="1"/>
+    <w:lsdException w:name="Body Text 3" w:semiHidden="1" w:unhideWhenUsed="1"/>
+    <w:lsdException w:name="Body Text Indent 2" w:semiHidden="1" w:unhideWhenUsed="1"/>
+    <w:lsdException w:name="Body Text Indent 3" w:semiHidden="1" w:unhideWhenUsed="1"/>
+    <w:lsdException w:name="Block Text" w:semiHidden="1" w:unhideWhenUsed="1"/>
+    <w:lsdException w:name="Hyperlink" w:semiHidden="1" w:unhideWhenUsed="1"/>
+    <w:lsdException w:name="FollowedHyperlink" w:semiHidden="1" w:unhideWhenUsed="1"/>
+    <w:lsdException w:name="Strong" w:uiPriority="22" w:qFormat="1"/>
+    <w:lsdException w:name="Emphasis" w:uiPriority="20" w:qFormat="1"/>
+    <w:lsdException w:name="Document Map" w:semiHidden="1" w:unhideWhenUsed="1"/>
+    <w:lsdException w:name="Plain Text" w:semiHidden="1" w:unhideWhenUsed="1"/>
+    <w:lsdException w:name="E-mail Signature" w:semiHidden="1" w:unhideWhenUsed="1"/>
+    <w:lsdException w:name="HTML Top of Form" w:semiHidden="1" w:unhideWhenUsed="1"/>
+    <w:lsdException w:name="HTML Bottom of Form" w:semiHidden="1" w:unhideWhenUsed="1"/>
+    <w:lsdException w:name="Normal (Web)" w:semiHidden="1" w:unhideWhenUsed="1"/>
+    <w:lsdException w:name="HTML Acronym" w:semiHidden="1" w:unhideWhenUsed="1"/>
+    <w:lsdException w:name="HTML Address" w:semiHidden="1" w:unhideWhenUsed="1"/>
+    <w:lsdException w:name="HTML Cite" w:semiHidden="1" w:unhideWhenUsed="1"/>
+    <w:lsdException w:name="HTML Code" w:semiHidden="1" w:unhideWhenUsed="1"/>
+    <w:lsdException w:name="HTML Definition" w:semiHidden="1" w:unhideWhenUsed="1"/>
+    <w:lsdException w:name="HTML Keyboard" w:semiHidden="1" w:unhideWhenUsed="1"/>
+    <w:lsdException w:name="HTML Preformatted" w:semiHidden="1" w:unhideWhenUsed="1"/>
+    <w:lsdException w:name="HTML Sample" w:semiHidden="1" w:unhideWhenUsed="1"/>
+    <w:lsdException w:name="HTML Typewriter" w:semiHidden="1" w:unhideWhenUsed="1"/>
+    <w:lsdException w:name="HTML Variable" w:semiHidden="1" w:unhideWhenUsed="1"/>
+    <w:lsdException w:name="Normal Table" w:semiHidden="1" w:unhideWhenUsed="1"/>
+    <w:lsdException w:name="annotation subject" w:semiHidden="1" w:unhideWhenUsed="1"/>
+    <w:lsdException w:name="No List" w:semiHidden="1" w:unhideWhenUsed="1"/>
+    <w:lsdException w:name="Outline List 1" w:semiHidden="1" w:unhideWhenUsed="1"/>
+    <w:lsdException w:name="Outline List 2" w:semiHidden="1" w:unhideWhenUsed="1"/>
+    <w:lsdException w:name="Outline List 3" w:semiHidden="1" w:unhideWhenUsed="1"/>
+    <w:lsdException w:name="Table Simple 1" w:semiHidden="1" w:unhideWhenUsed="1"/>
+    <w:lsdException w:name="Table Simple 2" w:semiHidden="1" w:unhideWhenUsed="1"/>
+    <w:lsdException w:name="Table Simple 3" w:semiHidden="1" w:unhideWhenUsed="1"/>
+    <w:lsdException w:name="Table Classic 1" w:semiHidden="1" w:unhideWhenUsed="1"/>
+    <w:lsdException w:name="Table Classic 2" w:semiHidden="1" w:unhideWhenUsed="1"/>
+    <w:lsdException w:name="Table Classic 3" w:semiHidden="1" w:unhideWhenUsed="1"/>
+    <w:lsdException w:name="Table Classic 4" w:semiHidden="1" w:unhideWhenUsed="1"/>
+    <w:lsdException w:name="Table Colorful 1" w:semiHidden="1" w:unhideWhenUsed="1"/>
+    <w:lsdException w:name="Table Colorful 2" w:semiHidden="1" w:unhideWhenUsed="1"/>
+    <w:lsdException w:name="Table Colorful 3" w:semiHidden="1" w:unhideWhenUsed="1"/>
+    <w:lsdException w:name="Table Columns 1" w:semiHidden="1" w:unhideWhenUsed="1"/>
+    <w:lsdException w:name="Table Columns 2" w:semiHidden="1" w:unhideWhenUsed="1"/>
+    <w:lsdException w:name="Table Columns 3" w:semiHidden="1" w:unhideWhenUsed="1"/>
+    <w:lsdException w:name="Table Columns 4" w:semiHidden="1" w:unhideWhenUsed="1"/>
+    <w:lsdException w:name="Table Columns 5" w:semiHidden="1" w:unhideWhenUsed="1"/>
+    <w:lsdException w:name="Table Grid 1" w:semiHidden="1" w:unhideWhenUsed="1"/>
+    <w:lsdException w:name="Table Grid 2" w:semiHidden="1" w:unhideWhenUsed="1"/>
+    <w:lsdException w:name="Table Grid 3" w:semiHidden="1" w:unhideWhenUsed="1"/>
+    <w:lsdException w:name="Table Grid 4" w:semiHidden="1" w:unhideWhenUsed="1"/>
+    <w:lsdException w:name="Table Grid 5" w:semiHidden="1" w:unhideWhenUsed="1"/>
+    <w:lsdException w:name="Table Grid 6" w:semiHidden="1" w:unhideWhenUsed="1"/>
+    <w:lsdException w:name="Table Grid 7" w:semiHidden="1" w:unhideWhenUsed="1"/>
+    <w:lsdException w:name="Table Grid 8" w:semiHidden="1" w:unhideWhenUsed="1"/>
+    <w:lsdException w:name="Table List 1" w:semiHidden="1" w:unhideWhenUsed="1"/>
+    <w:lsdException w:name="Table List 2" w:semiHidden="1" w:unhideWhenUsed="1"/>
+    <w:lsdException w:name="Table List 3" w:semiHidden="1" w:unhideWhenUsed="1"/>
+    <w:lsdException w:name="Table List 4" w:semiHidden="1" w:unhideWhenUsed="1"/>
+    <w:lsdException w:name="Table List 5" w:semiHidden="1" w:unhideWhenUsed="1"/>
+    <w:lsdException w:name="Table List 6" w:semiHidden="1" w:unhideWhenUsed="1"/>
+    <w:lsdException w:name="Table List 7" w:semiHidden="1" w:unhideWhenUsed="1"/>
+    <w:lsdException w:name="Table List 8" w:semiHidden="1" w:unhideWhenUsed="1"/>
+    <w:lsdException w:name="Table 3D effects 1" w:semiHidden="1" w:unhideWhenUsed="1"/>
+    <w:lsdException w:name="Table 3D effects 2" w:semiHidden="1" w:unhideWhenUsed="1"/>
+    <w:lsdException w:name="Table 3D effects 3" w:semiHidden="1" w:unhideWhenUsed="1"/>
+    <w:lsdException w:name="Table Contemporary" w:semiHidden="1" w:unhideWhenUsed="1"/>
+    <w:lsdException w:name="Table Elegant" w:semiHidden="1" w:unhideWhenUsed="1"/>
+    <w:lsdException w:name="Table Professional" w:semiHidden="1" w:unhideWhenUsed="1"/>
+    <w:lsdException w:name="Table Subtle 1" w:semiHidden="1" w:unhideWhenUsed="1"/>
+    <w:lsdException w:name="Table Subtle 2" w:semiHidden="1" w:unhideWhenUsed="1"/>
+    <w:lsdException w:name="Table Web 1" w:semiHidden="1" w:unhideWhenUsed="1"/>
+    <w:lsdException w:name="Table Web 2" w:semiHidden="1" w:unhideWhenUsed="1"/>
+    <w:lsdException w:name="Table Web 3" w:semiHidden="1" w:unhideWhenUsed="1"/>
+    <w:lsdException w:name="Balloon Text" w:semiHidden="1" w:unhideWhenUsed="1"/>
+    <w:lsdException w:name="Table Grid" w:uiPriority="59"/>
+    <w:lsdException w:name="Table Theme" w:semiHidden="1" w:unhideWhenUsed="1"/>
+    <w:lsdException w:name="Placeholder Text" w:semiHidden="1"/>
+    <w:lsdException w:name="No Spacing" w:uiPriority="1" w:qFormat="1"/>
+    <w:lsdException w:name="Light Shading" w:uiPriority="60"/>
+    <w:lsdException w:name="Light List" w:uiPriority="61"/>
+    <w:lsdException w:name="Light Grid" w:uiPriority="62"/>
+    <w:lsdException w:name="Medium Shading 1" w:uiPriority="63"/>
+    <w:lsdException w:name="Medium Shading 2" w:uiPriority="64"/>
+    <w:lsdException w:name="Medium List 1" w:uiPriority="65"/>
+    <w:lsdException w:name="Medium List 2" w:uiPriority="66"/>
+    <w:lsdException w:name="Medium Grid 1" w:uiPriority="67"/>
+    <w:lsdException w:name="Medium Grid 2" w:uiPriority="68"/>
+    <w:lsdException w:name="Medium Grid 3" w:uiPriority="69"/>
+    <w:lsdException w:name="Dark List" w:uiPriority="70"/>
+    <w:lsdException w:name="Colorful Shading" w:uiPriority="71"/>
+    <w:lsdException w:name="Colorful List" w:uiPriority="72"/>
+    <w:lsdException w:name="Colorful Grid" w:uiPriority="73"/>
+    <w:lsdException w:name="Light Shading Accent 1" w:uiPriority="60"/>
+    <w:lsdException w:name="Light List Accent 1" w:uiPriority="61"/>
+    <w:lsdException w:name="Light Grid Accent 1" w:uiPriority="62"/>
+    <w:lsdException w:name="Medium Shading 1 Accent 1" w:uiPriority="63"/>
+    <w:lsdException w:name="Medium Shading 2 Accent 1" w:uiPriority="64"/>
+    <w:lsdException w:name="Medium List 1 Accent 1" w:uiPriority="65"/>
+    <w:lsdException w:name="Revision" w:semiHidden="1"/>
+    <w:lsdException w:name="List Paragraph" w:uiPriority="34" w:qFormat="1"/>
+    <w:lsdException w:name="Quote" w:uiPriority="29" w:qFormat="1"/>
+    <w:lsdException w:name="Intense Quote" w:uiPriority="30" w:qFormat="1"/>
+    <w:lsdException w:name="Medium List 2 Accent 1" w:uiPriority="66"/>
+    <w:lsdException w:name="Medium Grid 1 Accent 1" w:uiPriority="67"/>
+    <w:lsdException w:name="Medium Grid 2 Accent 1" w:uiPriority="68"/>
+    <w:lsdException w:name="Medium Grid 3 Accent 1" w:uiPriority="69"/>
+    <w:lsdException w:name="Dark List Accent 1" w:uiPriority="70"/>
+    <w:lsdException w:name="Colorful Shading Accent 1" w:uiPriority="71"/>
+    <w:lsdException w:name="Colorful List Accent 1" w:uiPriority="72"/>
+    <w:lsdException w:name="Colorful Grid Accent 1" w:uiPriority="73"/>
+    <w:lsdException w:name="Light Shading Accent 2" w:uiPriority="60"/>
+    <w:lsdException w:name="Light List Accent 2" w:uiPriority="61"/>
+    <w:lsdException w:name="Light Grid Accent 2" w:uiPriority="62"/>
+    <w:lsdException w:name="Medium Shading 1 Accent 2" w:uiPriority="63"/>
+    <w:lsdException w:name="Medium Shading 2 Accent 2" w:uiPriority="64"/>
+    <w:lsdException w:name="Medium List 1 Accent 2" w:uiPriority="65"/>
+    <w:lsdException w:name="Medium List 2 Accent 2" w:uiPriority="66"/>
+    <w:lsdException w:name="Medium Grid 1 Accent 2" w:uiPriority="67"/>
+    <w:lsdException w:name="Medium Grid 2 Accent 2" w:uiPriority="68"/>
+    <w:lsdException w:name="Medium Grid 3 Accent 2" w:uiPriority="69"/>
+    <w:lsdException w:name="Dark List Accent 2" w:uiPriority="70"/>
+    <w:lsdException w:name="Colorful Shading Accent 2" w:uiPriority="71"/>
+    <w:lsdException w:name="Colorful List Accent 2" w:uiPriority="72"/>
+    <w:lsdException w:name="Colorful Grid Accent 2" w:uiPriority="73"/>
+    <w:lsdException w:name="Light Shading Accent 3" w:uiPriority="60"/>
+    <w:lsdException w:name="Light List Accent 3" w:uiPriority="61"/>
+    <w:lsdException w:name="Light Grid Accent 3" w:uiPriority="62"/>
+    <w:lsdException w:name="Medium Shading 1 Accent 3" w:uiPriority="63"/>
+    <w:lsdException w:name="Medium Shading 2 Accent 3" w:uiPriority="64"/>
+    <w:lsdException w:name="Medium List 1 Accent 3" w:uiPriority="65"/>
+    <w:lsdException w:name="Medium List 2 Accent 3" w:uiPriority="66"/>
+    <w:lsdException w:name="Medium Grid 1 Accent 3" w:uiPriority="67"/>
+    <w:lsdException w:name="Medium Grid 2 Accent 3" w:uiPriority="68"/>
+    <w:lsdException w:name="Medium Grid 3 Accent 3" w:uiPriority="69"/>
+    <w:lsdException w:name="Dark List Accent 3" w:uiPriority="70"/>
+    <w:lsdException w:name="Colorful Shading Accent 3" w:uiPriority="71"/>
+    <w:lsdException w:name="Colorful List Accent 3" w:uiPriority="72"/>
+    <w:lsdException w:name="Colorful Grid Accent 3" w:uiPriority="73"/>
+    <w:lsdException w:name="Light Shading Accent 4" w:uiPriority="60"/>
+    <w:lsdException w:name="Light List Accent 4" w:uiPriority="61"/>
+    <w:lsdException w:name="Light Grid Accent 4" w:uiPriority="62"/>
+    <w:lsdException w:name="Medium Shading 1 Accent 4" w:uiPriority="63"/>
+    <w:lsdException w:name="Medium Shading 2 Accent 4" w:uiPriority="64"/>
+    <w:lsdException w:name="Medium List 1 Accent 4" w:uiPriority="65"/>
+    <w:lsdException w:name="Medium List 2 Accent 4" w:uiPriority="66"/>
+    <w:lsdException w:name="Medium Grid 1 Accent 4" w:uiPriority="67"/>
+    <w:lsdException w:name="Medium Grid 2 Accent 4" w:uiPriority="68"/>
+    <w:lsdException w:name="Medium Grid 3 Accent 4" w:uiPriority="69"/>
+    <w:lsdException w:name="Dark List Accent 4" w:uiPriority="70"/>
+    <w:lsdException w:name="Colorful Shading Accent 4" w:uiPriority="71"/>
+    <w:lsdException w:name="Colorful List Accent 4" w:uiPriority="72"/>
+    <w:lsdException w:name="Colorful Grid Accent 4" w:uiPriority="73"/>
+    <w:lsdException w:name="Light Shading Accent 5" w:uiPriority="60"/>
+    <w:lsdException w:name="Light List Accent 5" w:uiPriority="61"/>
+    <w:lsdException w:name="Light Grid Accent 5" w:uiPriority="62"/>
+    <w:lsdException w:name="Medium Shading 1 Accent 5" w:uiPriority="63"/>
+    <w:lsdException w:name="Medium Shading 2 Accent 5" w:uiPriority="64"/>
+    <w:lsdException w:name="Medium List 1 Accent 5" w:uiPriority="65"/>
+    <w:lsdException w:name="Medium List 2 Accent 5" w:uiPriority="66"/>
+    <w:lsdException w:name="Medium Grid 1 Accent 5" w:uiPriority="67"/>
+    <w:lsdException w:name="Medium Grid 2 Accent 5" w:uiPriority="68"/>
+    <w:lsdException w:name="Medium Grid 3 Accent 5" w:uiPriority="69"/>
+    <w:lsdException w:name="Dark List Accent 5" w:uiPriority="70"/>
+    <w:lsdException w:name="Colorful Shading Accent 5" w:uiPriority="71"/>
+    <w:lsdException w:name="Colorful List Accent 5" w:uiPriority="72"/>
+    <w:lsdException w:name="Colorful Grid Accent 5" w:uiPriority="73"/>
+    <w:lsdException w:name="Light Shading Accent 6" w:uiPriority="60"/>
+    <w:lsdException w:name="Light List Accent 6" w:uiPriority="61"/>
+    <w:lsdException w:name="Light Grid Accent 6" w:uiPriority="62"/>
+    <w:lsdException w:name="Medium Shading 1 Accent 6" w:uiPriority="63"/>
+    <w:lsdException w:name="Medium Shading 2 Accent 6" w:uiPriority="64"/>
+    <w:lsdException w:name="Medium List 1 Accent 6" w:uiPriority="65"/>
+    <w:lsdException w:name="Medium List 2 Accent 6" w:uiPriority="66"/>
+    <w:lsdException w:name="Medium Grid 1 Accent 6" w:uiPriority="67"/>
+    <w:lsdException w:name="Medium Grid 2 Accent 6" w:uiPriority="68"/>
+    <w:lsdException w:name="Medium Grid 3 Accent 6" w:uiPriority="69"/>
+    <w:lsdException w:name="Dark List Accent 6" w:uiPriority="70"/>
+    <w:lsdException w:name="Colorful Shading Accent 6" w:uiPriority="71"/>
+    <w:lsdException w:name="Colorful List Accent 6" w:uiPriority="72"/>
+    <w:lsdException w:name="Colorful Grid Accent 6" w:uiPriority="73"/>
+    <w:lsdException w:name="Subtle Emphasis" w:uiPriority="19" w:qFormat="1"/>
+    <w:lsdException w:name="Intense Emphasis" w:uiPriority="21" w:qFormat="1"/>
+    <w:lsdException w:name="Subtle Reference" w:uiPriority="31" w:qFormat="1"/>
+    <w:lsdException w:name="Intense Reference" w:uiPriority="32" w:qFormat="1"/>
+    <w:lsdException w:name="Book Title" w:uiPriority="33" w:qFormat="1"/>
+    <w:lsdException w:name="Bibliography" w:semiHidden="1" w:uiPriority="37" w:unhideWhenUsed="1"/>
+    <w:lsdException w:name="TOC Heading" w:semiHidden="1" w:uiPriority="39" w:unhideWhenUsed="1" w:qFormat="1"/>
+    <w:lsdException w:name="Plain Table 1" w:uiPriority="41"/>
+    <w:lsdException w:name="Plain Table 2" w:uiPriority="42"/>
+    <w:lsdException w:name="Plain Table 3" w:uiPriority="43"/>
+    <w:lsdException w:name="Plain Table 4" w:uiPriority="44"/>
+    <w:lsdException w:name="Plain Table 5" w:uiPriority="45"/>
+    <w:lsdException w:name="Grid Table Light" w:uiPriority="40"/>
+    <w:lsdException w:name="Grid Table 1 Light" w:uiPriority="46"/>
+    <w:lsdException w:name="Grid Table 2" w:uiPriority="47"/>
+    <w:lsdException w:name="Grid Table 3" w:uiPriority="48"/>
+    <w:lsdException w:name="Grid Table 4" w:uiPriority="49"/>
+    <w:lsdException w:name="Grid Table 5 Dark" w:uiPriority="50"/>
+    <w:lsdException w:name="Grid Table 6 Colorful" w:uiPriority="51"/>
+    <w:lsdException w:name="Grid Table 7 Colorful" w:uiPriority="52"/>
+    <w:lsdException w:name="Grid Table 1 Light Accent 1" w:uiPriority="46"/>
+    <w:lsdException w:name="Grid Table 2 Accent 1" w:uiPriority="47"/>
+    <w:lsdException w:name="Grid Table 3 Accent 1" w:uiPriority="48"/>
+    <w:lsdException w:name="Grid Table 4 Accent 1" w:uiPriority="49"/>
+    <w:lsdException w:name="Grid Table 5 Dark Accent 1" w:uiPriority="50"/>
+    <w:lsdException w:name="Grid Table 6 Colorful Accent 1" w:uiPriority="51"/>
+    <w:lsdException w:name="Grid Table 7 Colorful Accent 1" w:uiPriority="52"/>
+    <w:lsdException w:name="Grid Table 1 Light Accent 2" w:uiPriority="46"/>
+    <w:lsdException w:name="Grid Table 2 Accent 2" w:uiPriority="47"/>
+    <w:lsdException w:name="Grid Table 3 Accent 2" w:uiPriority="48"/>
+    <w:lsdException w:name="Grid Table 4 Accent 2" w:uiPriority="49"/>
+    <w:lsdException w:name="Grid Table 5 Dark Accent 2" w:uiPriority="50"/>
+    <w:lsdException w:name="Grid Table 6 Colorful Accent 2" w:uiPriority="51"/>
+    <w:lsdException w:name="Grid Table 7 Colorful Accent 2" w:uiPriority="52"/>
+    <w:lsdException w:name="Grid Table 1 Light Accent 3" w:uiPriority="46"/>
+    <w:lsdException w:name="Grid Table 2 Accent 3" w:uiPriority="47"/>
+    <w:lsdException w:name="Grid Table 3 Accent 3" w:uiPriority="48"/>
+    <w:lsdException w:name="Grid Table 4 Accent 3" w:uiPriority="49"/>
+    <w:lsdException w:name="Grid Table 5 Dark Accent 3" w:uiPriority="50"/>
+    <w:lsdException w:name="Grid Table 6 Colorful Accent 3" w:uiPriority="51"/>
+    <w:lsdException w:name="Grid Table 7 Colorful Accent 3" w:uiPriority="52"/>
+    <w:lsdException w:name="Grid Table 1 Light Accent 4" w:uiPriority="46"/>
+    <w:lsdException w:name="Grid Table 2 Accent 4" w:uiPriority="47"/>
+    <w:lsdException w:name="Grid Table 3 Accent 4" w:uiPriority="48"/>
+    <w:lsdException w:name="Grid Table 4 Accent 4" w:uiPriority="49"/>
+    <w:lsdException w:name="Grid Table 5 Dark Accent 4" w:uiPriority="50"/>
+    <w:lsdException w:name="Grid Table 6 Colorful Accent 4" w:uiPriority="51"/>
+    <w:lsdException w:name="Grid Table 7 Colorful Accent 4" w:uiPriority="52"/>
+    <w:lsdException w:name="Grid Table 1 Light Accent 5" w:uiPriority="46"/>
+    <w:lsdException w:name="Grid Table 2 Accent 5" w:uiPriority="47"/>
+    <w:lsdException w:name="Grid Table 3 Accent 5" w:uiPriority="48"/>
+    <w:lsdException w:name="Grid Table 4 Accent 5" w:uiPriority="49"/>
+    <w:lsdException w:name="Grid Table 5 Dark Accent 5" w:uiPriority="50"/>
+    <w:lsdException w:name="Grid Table 6 Colorful Accent 5" w:uiPriority="51"/>
+    <w:lsdException w:name="Grid Table 7 Colorful Accent 5" w:uiPriority="52"/>
+    <w:lsdException w:name="Grid Table 1 Light Accent 6" w:uiPriority="46"/>
+    <w:lsdException w:name="Grid Table 2 Accent 6" w:uiPriority="47"/>
+    <w:lsdException w:name="Grid Table 3 Accent 6" w:uiPriority="48"/>
+    <w:lsdException w:name="Grid Table 4 Accent 6" w:uiPriority="49"/>
+    <w:lsdException w:name="Grid Table 5 Dark Accent 6" w:uiPriority="50"/>
+    <w:lsdException w:name="Grid Table 6 Colorful Accent 6" w:uiPriority="51"/>
+    <w:lsdException w:name="Grid Table 7 Colorful Accent 6" w:uiPriority="52"/>
+    <w:lsdException w:name="List Table 1 Light" w:uiPriority="46"/>
+    <w:lsdException w:name="List Table 2" w:uiPriority="47"/>
+    <w:lsdException w:name="List Table 3" w:uiPriority="48"/>
+    <w:lsdException w:name="List Table 4" w:uiPriority="49"/>
+    <w:lsdException w:name="List Table 5 Dark" w:uiPriority="50"/>
+    <w:lsdException w:name="List Table 6 Colorful" w:uiPriority="51"/>
+    <w:lsdException w:name="List Table 7 Colorful" w:uiPriority="52"/>
+    <w:lsdException w:name="List Table 1 Light Accent 1" w:uiPriority="46"/>
+    <w:lsdException w:name="List Table 2 Accent 1" w:uiPriority="47"/>
+    <w:lsdException w:name="List Table 3 Accent 1" w:uiPriority="48"/>
+    <w:lsdException w:name="List Table 4 Accent 1" w:uiPriority="49"/>
+    <w:lsdException w:name="List Table 5 Dark Accent 1" w:uiPriority="50"/>
+    <w:lsdException w:name="List Table 6 Colorful Accent 1" w:uiPriority="51"/>
+    <w:lsdException w:name="List Table 7 Colorful Accent 1" w:uiPriority="52"/>
+    <w:lsdException w:name="List Table 1 Light Accent 2" w:uiPriority="46"/>
+    <w:lsdException w:name="List Table 2 Accent 2" w:uiPriority="47"/>
+    <w:lsdException w:name="List Table 3 Accent 2" w:uiPriority="48"/>
+    <w:lsdException w:name="List Table 4 Accent 2" w:uiPriority="49"/>
+    <w:lsdException w:name="List Table 5 Dark Accent 2" w:uiPriority="50"/>
+    <w:lsdException w:name="List Table 6 Colorful Accent 2" w:uiPriority="51"/>
+    <w:lsdException w:name="List Table 7 Colorful Accent 2" w:uiPriority="52"/>
+    <w:lsdException w:name="List Table 1 Light Accent 3" w:uiPriority="46"/>
+    <w:lsdException w:name="List Table 2 Accent 3" w:uiPriority="47"/>
+    <w:lsdException w:name="List Table 3 Accent 3" w:uiPriority="48"/>
+    <w:lsdException w:name="List Table 4 Accent 3" w:uiPriority="49"/>
+    <w:lsdException w:name="List Table 5 Dark Accent 3" w:uiPriority="50"/>
+    <w:lsdException w:name="List Table 6 Colorful Accent 3" w:uiPriority="51"/>
+    <w:lsdException w:name="List Table 7 Colorful Accent 3" w:uiPriority="52"/>
+    <w:lsdException w:name="List Table 1 Light Accent 4" w:uiPriority="46"/>
+    <w:lsdException w:name="List Table 2 Accent 4" w:uiPriority="47"/>
+    <w:lsdException w:name="List Table 3 Accent 4" w:uiPriority="48"/>
+    <w:lsdException w:name="List Table 4 Accent 4" w:uiPriority="49"/>
+    <w:lsdException w:name="List Table 5 Dark Accent 4" w:uiPriority="50"/>
+    <w:lsdException w:name="List Table 6 Colorful Accent 4" w:uiPriority="51"/>
+    <w:lsdException w:name="List Table 7 Colorful Accent 4" w:uiPriority="52"/>
+    <w:lsdException w:name="List Table 1 Light Accent 5" w:uiPriority="46"/>
+    <w:lsdException w:name="List Table 2 Accent 5" w:uiPriority="47"/>
+    <w:lsdException w:name="List Table 3 Accent 5" w:uiPriority="48"/>
+    <w:lsdException w:name="List Table 4 Accent 5" w:uiPriority="49"/>
+    <w:lsdException w:name="List Table 5 Dark Accent 5" w:uiPriority="50"/>
+    <w:lsdException w:name="List Table 6 Colorful Accent 5" w:uiPriority="51"/>
+    <w:lsdException w:name="List Table 7 Colorful Accent 5" w:uiPriority="52"/>
+    <w:lsdException w:name="List Table 1 Light Accent 6" w:uiPriority="46"/>
+    <w:lsdException w:name="List Table 2 Accent 6" w:uiPriority="47"/>
+    <w:lsdException w:name="List Table 3 Accent 6" w:uiPriority="48"/>
+    <w:lsdException w:name="List Table 4 Accent 6" w:uiPriority="49"/>
+    <w:lsdException w:name="List Table 5 Dark Accent 6" w:uiPriority="50"/>
+    <w:lsdException w:name="List Table 6 Colorful Accent 6" w:uiPriority="51"/>
+    <w:lsdException w:name="List Table 7 Colorful Accent 6" w:uiPriority="52"/>
   </w:latentStyles>
   <w:style w:type="paragraph" w:default="1" w:styleId="a">
     <w:name w:val="Normal"/>
@@ -1053,227 +1309,7 @@
     </w:rPr>
   </w:style>
   <w:style w:type="character" w:customStyle="1" w:styleId="a4">
-    <w:name w:val="Текст выноски Знак"/>
-    <w:basedOn w:val="a0"/>
-    <w:link w:val="a3"/>
-    <w:uiPriority w:val="99"/>
-    <w:semiHidden/>
-    <w:rsid w:val="005026BC"/>
-    <w:rPr>
-      <w:rFonts w:ascii="Tahoma" w:hAnsi="Tahoma" w:cs="Tahoma"/>
-      <w:sz w:val="16"/>
-      <w:szCs w:val="16"/>
-    </w:rPr>
-  </w:style>
-</w:styles>
-</file>
-
-<file path=word/stylesWithEffects.xml><?xml version="1.0" encoding="utf-8"?>
-<w:styles xmlns:wpc="http://schemas.microsoft.com/office/word/2010/wordprocessingCanvas" xmlns:mc="http://schemas.openxmlformats.org/markup-compatibility/2006" xmlns:o="urn:schemas-microsoft-com:office:office" xmlns:r="http://schemas.openxmlformats.org/officeDocument/2006/relationships" xmlns:m="http://schemas.openxmlformats.org/officeDocument/2006/math" xmlns:v="urn:schemas-microsoft-com:vml" xmlns:wp14="http://schemas.microsoft.com/office/word/2010/wordprocessingDrawing" xmlns:wp="http://schemas.openxmlformats.org/drawingml/2006/wordprocessingDrawing" xmlns:w10="urn:schemas-microsoft-com:office:word" xmlns:w="http://schemas.openxmlformats.org/wordprocessingml/2006/main" xmlns:w14="http://schemas.microsoft.com/office/word/2010/wordml" xmlns:wpg="http://schemas.microsoft.com/office/word/2010/wordprocessingGroup" xmlns:wpi="http://schemas.microsoft.com/office/word/2010/wordprocessingInk" xmlns:wne="http://schemas.microsoft.com/office/word/2006/wordml" xmlns:wps="http://schemas.microsoft.com/office/word/2010/wordprocessingShape" mc:Ignorable="w14 wp14">
-  <w:docDefaults>
-    <w:rPrDefault>
-      <w:rPr>
-        <w:rFonts w:asciiTheme="minorHAnsi" w:eastAsiaTheme="minorHAnsi" w:hAnsiTheme="minorHAnsi" w:cstheme="minorBidi"/>
-        <w:sz w:val="22"/>
-        <w:szCs w:val="22"/>
-        <w:lang w:val="ru-RU" w:eastAsia="en-US" w:bidi="ar-SA"/>
-      </w:rPr>
-    </w:rPrDefault>
-    <w:pPrDefault>
-      <w:pPr>
-        <w:spacing w:after="200" w:line="276" w:lineRule="auto"/>
-      </w:pPr>
-    </w:pPrDefault>
-  </w:docDefaults>
-  <w:latentStyles w:defLockedState="0" w:defUIPriority="99" w:defSemiHidden="1" w:defUnhideWhenUsed="1" w:defQFormat="0" w:count="267">
-    <w:lsdException w:name="Normal" w:semiHidden="0" w:uiPriority="0" w:unhideWhenUsed="0" w:qFormat="1"/>
-    <w:lsdException w:name="heading 1" w:semiHidden="0" w:uiPriority="9" w:unhideWhenUsed="0" w:qFormat="1"/>
-    <w:lsdException w:name="heading 2" w:uiPriority="9" w:qFormat="1"/>
-    <w:lsdException w:name="heading 3" w:uiPriority="9" w:qFormat="1"/>
-    <w:lsdException w:name="heading 4" w:uiPriority="9" w:qFormat="1"/>
-    <w:lsdException w:name="heading 5" w:uiPriority="9" w:qFormat="1"/>
-    <w:lsdException w:name="heading 6" w:uiPriority="9" w:qFormat="1"/>
-    <w:lsdException w:name="heading 7" w:uiPriority="9" w:qFormat="1"/>
-    <w:lsdException w:name="heading 8" w:uiPriority="9" w:qFormat="1"/>
-    <w:lsdException w:name="heading 9" w:uiPriority="9" w:qFormat="1"/>
-    <w:lsdException w:name="toc 1" w:uiPriority="39"/>
-    <w:lsdException w:name="toc 2" w:uiPriority="39"/>
-    <w:lsdException w:name="toc 3" w:uiPriority="39"/>
-    <w:lsdException w:name="toc 4" w:uiPriority="39"/>
-    <w:lsdException w:name="toc 5" w:uiPriority="39"/>
-    <w:lsdException w:name="toc 6" w:uiPriority="39"/>
-    <w:lsdException w:name="toc 7" w:uiPriority="39"/>
-    <w:lsdException w:name="toc 8" w:uiPriority="39"/>
-    <w:lsdException w:name="toc 9" w:uiPriority="39"/>
-    <w:lsdException w:name="caption" w:uiPriority="35" w:qFormat="1"/>
-    <w:lsdException w:name="Title" w:semiHidden="0" w:uiPriority="10" w:unhideWhenUsed="0" w:qFormat="1"/>
-    <w:lsdException w:name="Default Paragraph Font" w:uiPriority="1"/>
-    <w:lsdException w:name="Subtitle" w:semiHidden="0" w:uiPriority="11" w:unhideWhenUsed="0" w:qFormat="1"/>
-    <w:lsdException w:name="Strong" w:semiHidden="0" w:uiPriority="22" w:unhideWhenUsed="0" w:qFormat="1"/>
-    <w:lsdException w:name="Emphasis" w:semiHidden="0" w:uiPriority="20" w:unhideWhenUsed="0" w:qFormat="1"/>
-    <w:lsdException w:name="Table Grid" w:semiHidden="0" w:uiPriority="59" w:unhideWhenUsed="0"/>
-    <w:lsdException w:name="Placeholder Text" w:unhideWhenUsed="0"/>
-    <w:lsdException w:name="No Spacing" w:semiHidden="0" w:uiPriority="1" w:unhideWhenUsed="0" w:qFormat="1"/>
-    <w:lsdException w:name="Light Shading" w:semiHidden="0" w:uiPriority="60" w:unhideWhenUsed="0"/>
-    <w:lsdException w:name="Light List" w:semiHidden="0" w:uiPriority="61" w:unhideWhenUsed="0"/>
-    <w:lsdException w:name="Light Grid" w:semiHidden="0" w:uiPriority="62" w:unhideWhenUsed="0"/>
-    <w:lsdException w:name="Medium Shading 1" w:semiHidden="0" w:uiPriority="63" w:unhideWhenUsed="0"/>
-    <w:lsdException w:name="Medium Shading 2" w:semiHidden="0" w:uiPriority="64" w:unhideWhenUsed="0"/>
-    <w:lsdException w:name="Medium List 1" w:semiHidden="0" w:uiPriority="65" w:unhideWhenUsed="0"/>
-    <w:lsdException w:name="Medium List 2" w:semiHidden="0" w:uiPriority="66" w:unhideWhenUsed="0"/>
-    <w:lsdException w:name="Medium Grid 1" w:semiHidden="0" w:uiPriority="67" w:unhideWhenUsed="0"/>
-    <w:lsdException w:name="Medium Grid 2" w:semiHidden="0" w:uiPriority="68" w:unhideWhenUsed="0"/>
-    <w:lsdException w:name="Medium Grid 3" w:semiHidden="0" w:uiPriority="69" w:unhideWhenUsed="0"/>
-    <w:lsdException w:name="Dark List" w:semiHidden="0" w:uiPriority="70" w:unhideWhenUsed="0"/>
-    <w:lsdException w:name="Colorful Shading" w:semiHidden="0" w:uiPriority="71" w:unhideWhenUsed="0"/>
-    <w:lsdException w:name="Colorful List" w:semiHidden="0" w:uiPriority="72" w:unhideWhenUsed="0"/>
-    <w:lsdException w:name="Colorful Grid" w:semiHidden="0" w:uiPriority="73" w:unhideWhenUsed="0"/>
-    <w:lsdException w:name="Light Shading Accent 1" w:semiHidden="0" w:uiPriority="60" w:unhideWhenUsed="0"/>
-    <w:lsdException w:name="Light List Accent 1" w:semiHidden="0" w:uiPriority="61" w:unhideWhenUsed="0"/>
-    <w:lsdException w:name="Light Grid Accent 1" w:semiHidden="0" w:uiPriority="62" w:unhideWhenUsed="0"/>
-    <w:lsdException w:name="Medium Shading 1 Accent 1" w:semiHidden="0" w:uiPriority="63" w:unhideWhenUsed="0"/>
-    <w:lsdException w:name="Medium Shading 2 Accent 1" w:semiHidden="0" w:uiPriority="64" w:unhideWhenUsed="0"/>
-    <w:lsdException w:name="Medium List 1 Accent 1" w:semiHidden="0" w:uiPriority="65" w:unhideWhenUsed="0"/>
-    <w:lsdException w:name="Revision" w:unhideWhenUsed="0"/>
-    <w:lsdException w:name="List Paragraph" w:semiHidden="0" w:uiPriority="34" w:unhideWhenUsed="0" w:qFormat="1"/>
-    <w:lsdException w:name="Quote" w:semiHidden="0" w:uiPriority="29" w:unhideWhenUsed="0" w:qFormat="1"/>
-    <w:lsdException w:name="Intense Quote" w:semiHidden="0" w:uiPriority="30" w:unhideWhenUsed="0" w:qFormat="1"/>
-    <w:lsdException w:name="Medium List 2 Accent 1" w:semiHidden="0" w:uiPriority="66" w:unhideWhenUsed="0"/>
-    <w:lsdException w:name="Medium Grid 1 Accent 1" w:semiHidden="0" w:uiPriority="67" w:unhideWhenUsed="0"/>
-    <w:lsdException w:name="Medium Grid 2 Accent 1" w:semiHidden="0" w:uiPriority="68" w:unhideWhenUsed="0"/>
-    <w:lsdException w:name="Medium Grid 3 Accent 1" w:semiHidden="0" w:uiPriority="69" w:unhideWhenUsed="0"/>
-    <w:lsdException w:name="Dark List Accent 1" w:semiHidden="0" w:uiPriority="70" w:unhideWhenUsed="0"/>
-    <w:lsdException w:name="Colorful Shading Accent 1" w:semiHidden="0" w:uiPriority="71" w:unhideWhenUsed="0"/>
-    <w:lsdException w:name="Colorful List Accent 1" w:semiHidden="0" w:uiPriority="72" w:unhideWhenUsed="0"/>
-    <w:lsdException w:name="Colorful Grid Accent 1" w:semiHidden="0" w:uiPriority="73" w:unhideWhenUsed="0"/>
-    <w:lsdException w:name="Light Shading Accent 2" w:semiHidden="0" w:uiPriority="60" w:unhideWhenUsed="0"/>
-    <w:lsdException w:name="Light List Accent 2" w:semiHidden="0" w:uiPriority="61" w:unhideWhenUsed="0"/>
-    <w:lsdException w:name="Light Grid Accent 2" w:semiHidden="0" w:uiPriority="62" w:unhideWhenUsed="0"/>
-    <w:lsdException w:name="Medium Shading 1 Accent 2" w:semiHidden="0" w:uiPriority="63" w:unhideWhenUsed="0"/>
-    <w:lsdException w:name="Medium Shading 2 Accent 2" w:semiHidden="0" w:uiPriority="64" w:unhideWhenUsed="0"/>
-    <w:lsdException w:name="Medium List 1 Accent 2" w:semiHidden="0" w:uiPriority="65" w:unhideWhenUsed="0"/>
-    <w:lsdException w:name="Medium List 2 Accent 2" w:semiHidden="0" w:uiPriority="66" w:unhideWhenUsed="0"/>
-    <w:lsdException w:name="Medium Grid 1 Accent 2" w:semiHidden="0" w:uiPriority="67" w:unhideWhenUsed="0"/>
-    <w:lsdException w:name="Medium Grid 2 Accent 2" w:semiHidden="0" w:uiPriority="68" w:unhideWhenUsed="0"/>
-    <w:lsdException w:name="Medium Grid 3 Accent 2" w:semiHidden="0" w:uiPriority="69" w:unhideWhenUsed="0"/>
-    <w:lsdException w:name="Dark List Accent 2" w:semiHidden="0" w:uiPriority="70" w:unhideWhenUsed="0"/>
-    <w:lsdException w:name="Colorful Shading Accent 2" w:semiHidden="0" w:uiPriority="71" w:unhideWhenUsed="0"/>
-    <w:lsdException w:name="Colorful List Accent 2" w:semiHidden="0" w:uiPriority="72" w:unhideWhenUsed="0"/>
-    <w:lsdException w:name="Colorful Grid Accent 2" w:semiHidden="0" w:uiPriority="73" w:unhideWhenUsed="0"/>
-    <w:lsdException w:name="Light Shading Accent 3" w:semiHidden="0" w:uiPriority="60" w:unhideWhenUsed="0"/>
-    <w:lsdException w:name="Light List Accent 3" w:semiHidden="0" w:uiPriority="61" w:unhideWhenUsed="0"/>
-    <w:lsdException w:name="Light Grid Accent 3" w:semiHidden="0" w:uiPriority="62" w:unhideWhenUsed="0"/>
-    <w:lsdException w:name="Medium Shading 1 Accent 3" w:semiHidden="0" w:uiPriority="63" w:unhideWhenUsed="0"/>
-    <w:lsdException w:name="Medium Shading 2 Accent 3" w:semiHidden="0" w:uiPriority="64" w:unhideWhenUsed="0"/>
-    <w:lsdException w:name="Medium List 1 Accent 3" w:semiHidden="0" w:uiPriority="65" w:unhideWhenUsed="0"/>
-    <w:lsdException w:name="Medium List 2 Accent 3" w:semiHidden="0" w:uiPriority="66" w:unhideWhenUsed="0"/>
-    <w:lsdException w:name="Medium Grid 1 Accent 3" w:semiHidden="0" w:uiPriority="67" w:unhideWhenUsed="0"/>
-    <w:lsdException w:name="Medium Grid 2 Accent 3" w:semiHidden="0" w:uiPriority="68" w:unhideWhenUsed="0"/>
-    <w:lsdException w:name="Medium Grid 3 Accent 3" w:semiHidden="0" w:uiPriority="69" w:unhideWhenUsed="0"/>
-    <w:lsdException w:name="Dark List Accent 3" w:semiHidden="0" w:uiPriority="70" w:unhideWhenUsed="0"/>
-    <w:lsdException w:name="Colorful Shading Accent 3" w:semiHidden="0" w:uiPriority="71" w:unhideWhenUsed="0"/>
-    <w:lsdException w:name="Colorful List Accent 3" w:semiHidden="0" w:uiPriority="72" w:unhideWhenUsed="0"/>
-    <w:lsdException w:name="Colorful Grid Accent 3" w:semiHidden="0" w:uiPriority="73" w:unhideWhenUsed="0"/>
-    <w:lsdException w:name="Light Shading Accent 4" w:semiHidden="0" w:uiPriority="60" w:unhideWhenUsed="0"/>
-    <w:lsdException w:name="Light List Accent 4" w:semiHidden="0" w:uiPriority="61" w:unhideWhenUsed="0"/>
-    <w:lsdException w:name="Light Grid Accent 4" w:semiHidden="0" w:uiPriority="62" w:unhideWhenUsed="0"/>
-    <w:lsdException w:name="Medium Shading 1 Accent 4" w:semiHidden="0" w:uiPriority="63" w:unhideWhenUsed="0"/>
-    <w:lsdException w:name="Medium Shading 2 Accent 4" w:semiHidden="0" w:uiPriority="64" w:unhideWhenUsed="0"/>
-    <w:lsdException w:name="Medium List 1 Accent 4" w:semiHidden="0" w:uiPriority="65" w:unhideWhenUsed="0"/>
-    <w:lsdException w:name="Medium List 2 Accent 4" w:semiHidden="0" w:uiPriority="66" w:unhideWhenUsed="0"/>
-    <w:lsdException w:name="Medium Grid 1 Accent 4" w:semiHidden="0" w:uiPriority="67" w:unhideWhenUsed="0"/>
-    <w:lsdException w:name="Medium Grid 2 Accent 4" w:semiHidden="0" w:uiPriority="68" w:unhideWhenUsed="0"/>
-    <w:lsdException w:name="Medium Grid 3 Accent 4" w:semiHidden="0" w:uiPriority="69" w:unhideWhenUsed="0"/>
-    <w:lsdException w:name="Dark List Accent 4" w:semiHidden="0" w:uiPriority="70" w:unhideWhenUsed="0"/>
-    <w:lsdException w:name="Colorful Shading Accent 4" w:semiHidden="0" w:uiPriority="71" w:unhideWhenUsed="0"/>
-    <w:lsdException w:name="Colorful List Accent 4" w:semiHidden="0" w:uiPriority="72" w:unhideWhenUsed="0"/>
-    <w:lsdException w:name="Colorful Grid Accent 4" w:semiHidden="0" w:uiPriority="73" w:unhideWhenUsed="0"/>
-    <w:lsdException w:name="Light Shading Accent 5" w:semiHidden="0" w:uiPriority="60" w:unhideWhenUsed="0"/>
-    <w:lsdException w:name="Light List Accent 5" w:semiHidden="0" w:uiPriority="61" w:unhideWhenUsed="0"/>
-    <w:lsdException w:name="Light Grid Accent 5" w:semiHidden="0" w:uiPriority="62" w:unhideWhenUsed="0"/>
-    <w:lsdException w:name="Medium Shading 1 Accent 5" w:semiHidden="0" w:uiPriority="63" w:unhideWhenUsed="0"/>
-    <w:lsdException w:name="Medium Shading 2 Accent 5" w:semiHidden="0" w:uiPriority="64" w:unhideWhenUsed="0"/>
-    <w:lsdException w:name="Medium List 1 Accent 5" w:semiHidden="0" w:uiPriority="65" w:unhideWhenUsed="0"/>
-    <w:lsdException w:name="Medium List 2 Accent 5" w:semiHidden="0" w:uiPriority="66" w:unhideWhenUsed="0"/>
-    <w:lsdException w:name="Medium Grid 1 Accent 5" w:semiHidden="0" w:uiPriority="67" w:unhideWhenUsed="0"/>
-    <w:lsdException w:name="Medium Grid 2 Accent 5" w:semiHidden="0" w:uiPriority="68" w:unhideWhenUsed="0"/>
-    <w:lsdException w:name="Medium Grid 3 Accent 5" w:semiHidden="0" w:uiPriority="69" w:unhideWhenUsed="0"/>
-    <w:lsdException w:name="Dark List Accent 5" w:semiHidden="0" w:uiPriority="70" w:unhideWhenUsed="0"/>
-    <w:lsdException w:name="Colorful Shading Accent 5" w:semiHidden="0" w:uiPriority="71" w:unhideWhenUsed="0"/>
-    <w:lsdException w:name="Colorful List Accent 5" w:semiHidden="0" w:uiPriority="72" w:unhideWhenUsed="0"/>
-    <w:lsdException w:name="Colorful Grid Accent 5" w:semiHidden="0" w:uiPriority="73" w:unhideWhenUsed="0"/>
-    <w:lsdException w:name="Light Shading Accent 6" w:semiHidden="0" w:uiPriority="60" w:unhideWhenUsed="0"/>
-    <w:lsdException w:name="Light List Accent 6" w:semiHidden="0" w:uiPriority="61" w:unhideWhenUsed="0"/>
-    <w:lsdException w:name="Light Grid Accent 6" w:semiHidden="0" w:uiPriority="62" w:unhideWhenUsed="0"/>
-    <w:lsdException w:name="Medium Shading 1 Accent 6" w:semiHidden="0" w:uiPriority="63" w:unhideWhenUsed="0"/>
-    <w:lsdException w:name="Medium Shading 2 Accent 6" w:semiHidden="0" w:uiPriority="64" w:unhideWhenUsed="0"/>
-    <w:lsdException w:name="Medium List 1 Accent 6" w:semiHidden="0" w:uiPriority="65" w:unhideWhenUsed="0"/>
-    <w:lsdException w:name="Medium List 2 Accent 6" w:semiHidden="0" w:uiPriority="66" w:unhideWhenUsed="0"/>
-    <w:lsdException w:name="Medium Grid 1 Accent 6" w:semiHidden="0" w:uiPriority="67" w:unhideWhenUsed="0"/>
-    <w:lsdException w:name="Medium Grid 2 Accent 6" w:semiHidden="0" w:uiPriority="68" w:unhideWhenUsed="0"/>
-    <w:lsdException w:name="Medium Grid 3 Accent 6" w:semiHidden="0" w:uiPriority="69" w:unhideWhenUsed="0"/>
-    <w:lsdException w:name="Dark List Accent 6" w:semiHidden="0" w:uiPriority="70" w:unhideWhenUsed="0"/>
-    <w:lsdException w:name="Colorful Shading Accent 6" w:semiHidden="0" w:uiPriority="71" w:unhideWhenUsed="0"/>
-    <w:lsdException w:name="Colorful List Accent 6" w:semiHidden="0" w:uiPriority="72" w:unhideWhenUsed="0"/>
-    <w:lsdException w:name="Colorful Grid Accent 6" w:semiHidden="0" w:uiPriority="73" w:unhideWhenUsed="0"/>
-    <w:lsdException w:name="Subtle Emphasis" w:semiHidden="0" w:uiPriority="19" w:unhideWhenUsed="0" w:qFormat="1"/>
-    <w:lsdException w:name="Intense Emphasis" w:semiHidden="0" w:uiPriority="21" w:unhideWhenUsed="0" w:qFormat="1"/>
-    <w:lsdException w:name="Subtle Reference" w:semiHidden="0" w:uiPriority="31" w:unhideWhenUsed="0" w:qFormat="1"/>
-    <w:lsdException w:name="Intense Reference" w:semiHidden="0" w:uiPriority="32" w:unhideWhenUsed="0" w:qFormat="1"/>
-    <w:lsdException w:name="Book Title" w:semiHidden="0" w:uiPriority="33" w:unhideWhenUsed="0" w:qFormat="1"/>
-    <w:lsdException w:name="Bibliography" w:uiPriority="37"/>
-    <w:lsdException w:name="TOC Heading" w:uiPriority="39" w:qFormat="1"/>
-  </w:latentStyles>
-  <w:style w:type="paragraph" w:default="1" w:styleId="a">
-    <w:name w:val="Normal"/>
-    <w:qFormat/>
-  </w:style>
-  <w:style w:type="character" w:default="1" w:styleId="a0">
-    <w:name w:val="Default Paragraph Font"/>
-    <w:uiPriority w:val="1"/>
-    <w:semiHidden/>
-    <w:unhideWhenUsed/>
-  </w:style>
-  <w:style w:type="table" w:default="1" w:styleId="a1">
-    <w:name w:val="Normal Table"/>
-    <w:uiPriority w:val="99"/>
-    <w:semiHidden/>
-    <w:unhideWhenUsed/>
-    <w:tblPr>
-      <w:tblInd w:w="0" w:type="dxa"/>
-      <w:tblCellMar>
-        <w:top w:w="0" w:type="dxa"/>
-        <w:left w:w="108" w:type="dxa"/>
-        <w:bottom w:w="0" w:type="dxa"/>
-        <w:right w:w="108" w:type="dxa"/>
-      </w:tblCellMar>
-    </w:tblPr>
-  </w:style>
-  <w:style w:type="numbering" w:default="1" w:styleId="a2">
-    <w:name w:val="No List"/>
-    <w:uiPriority w:val="99"/>
-    <w:semiHidden/>
-    <w:unhideWhenUsed/>
-  </w:style>
-  <w:style w:type="paragraph" w:styleId="a3">
-    <w:name w:val="Balloon Text"/>
-    <w:basedOn w:val="a"/>
-    <w:link w:val="a4"/>
-    <w:uiPriority w:val="99"/>
-    <w:semiHidden/>
-    <w:unhideWhenUsed/>
-    <w:rsid w:val="005026BC"/>
-    <w:pPr>
-      <w:spacing w:after="0" w:line="240" w:lineRule="auto"/>
-    </w:pPr>
-    <w:rPr>
-      <w:rFonts w:ascii="Tahoma" w:hAnsi="Tahoma" w:cs="Tahoma"/>
-      <w:sz w:val="16"/>
-      <w:szCs w:val="16"/>
-    </w:rPr>
-  </w:style>
-  <w:style w:type="character" w:customStyle="1" w:styleId="a4">
-    <w:name w:val="Текст выноски Знак"/>
+    <w:name w:val="Текст у виносці Знак"/>
     <w:basedOn w:val="a0"/>
     <w:link w:val="a3"/>
     <w:uiPriority w:val="99"/>

</xml_diff>